<commit_message>
Update final formatted report
Co-authored-by: Cursor <cursoragent@cursor.com>
</commit_message>
<xml_diff>
--- a/deliverables/04_manuscript/report.docx
+++ b/deliverables/04_manuscript/report.docx
@@ -1525,10 +1525,10 @@
           <w:noProof/>
         </w:rPr>
         <w:drawing>
-          <wp:inline distT="0" distB="0" distL="0" distR="0" wp14:anchorId="71AE0159" wp14:editId="3B76B5A2">
+          <wp:inline distT="0" distB="0" distL="0" distR="0" wp14:anchorId="2A31F3FC" wp14:editId="5969C105">
             <wp:extent cx="5334000" cy="4440530"/>
             <wp:effectExtent l="0" t="0" r="0" b="0"/>
-            <wp:docPr id="11" name="Picture" descr="图1 S组不同总剂量下的转移特性（线性坐标）"/>
+            <wp:docPr id="11" name="Picture" descr="S组不同总剂量下的转移特性（线性坐标）"/>
             <wp:cNvGraphicFramePr/>
             <a:graphic xmlns:a="http://schemas.openxmlformats.org/drawingml/2006/main">
               <a:graphicData uri="http://schemas.openxmlformats.org/drawingml/2006/picture">
@@ -1575,21 +1575,6 @@
         <w:rPr>
           <w:rFonts w:hint="eastAsia"/>
         </w:rPr>
-        <w:t>图</w:t>
-      </w:r>
-      <w:r>
-        <w:rPr>
-          <w:rFonts w:hint="eastAsia"/>
-        </w:rPr>
-        <w:t>1</w:t>
-      </w:r>
-      <w:r>
-        <w:t xml:space="preserve"> </w:t>
-      </w:r>
-      <w:r>
-        <w:rPr>
-          <w:rFonts w:hint="eastAsia"/>
-        </w:rPr>
         <w:t>S</w:t>
       </w:r>
       <w:r>
@@ -1609,10 +1594,10 @@
         </w:rPr>
         <w:lastRenderedPageBreak/>
         <w:drawing>
-          <wp:inline distT="0" distB="0" distL="0" distR="0" wp14:anchorId="5422DCE5" wp14:editId="58811D40">
+          <wp:inline distT="0" distB="0" distL="0" distR="0" wp14:anchorId="491EB8AE" wp14:editId="3A9FB936">
             <wp:extent cx="5334000" cy="4354429"/>
             <wp:effectExtent l="0" t="0" r="0" b="0"/>
-            <wp:docPr id="14" name="Picture" descr="图2 S组不同总剂量下的转移特性（半对数坐标）"/>
+            <wp:docPr id="14" name="Picture" descr="S组不同总剂量下的转移特性（半对数坐标）"/>
             <wp:cNvGraphicFramePr/>
             <a:graphic xmlns:a="http://schemas.openxmlformats.org/drawingml/2006/main">
               <a:graphicData uri="http://schemas.openxmlformats.org/drawingml/2006/picture">
@@ -1659,21 +1644,6 @@
         <w:rPr>
           <w:rFonts w:hint="eastAsia"/>
         </w:rPr>
-        <w:t>图</w:t>
-      </w:r>
-      <w:r>
-        <w:rPr>
-          <w:rFonts w:hint="eastAsia"/>
-        </w:rPr>
-        <w:t>2</w:t>
-      </w:r>
-      <w:r>
-        <w:t xml:space="preserve"> </w:t>
-      </w:r>
-      <w:r>
-        <w:rPr>
-          <w:rFonts w:hint="eastAsia"/>
-        </w:rPr>
         <w:t>S</w:t>
       </w:r>
       <w:r>
@@ -1693,10 +1663,10 @@
         </w:rPr>
         <w:lastRenderedPageBreak/>
         <w:drawing>
-          <wp:inline distT="0" distB="0" distL="0" distR="0" wp14:anchorId="6C4BF4D7" wp14:editId="38FCDF15">
+          <wp:inline distT="0" distB="0" distL="0" distR="0" wp14:anchorId="1C9129D5" wp14:editId="07FE825C">
             <wp:extent cx="5334000" cy="3546760"/>
             <wp:effectExtent l="0" t="0" r="0" b="0"/>
-            <wp:docPr id="17" name="Picture" descr="图3 S组不同总剂量下的输出特性（VGS=-20 V，半对数坐标）"/>
+            <wp:docPr id="17" name="Picture" descr="S组不同总剂量下的输出特性（VGS=-20 V，半对数坐标）"/>
             <wp:cNvGraphicFramePr/>
             <a:graphic xmlns:a="http://schemas.openxmlformats.org/drawingml/2006/main">
               <a:graphicData uri="http://schemas.openxmlformats.org/drawingml/2006/picture">
@@ -1743,21 +1713,6 @@
         <w:rPr>
           <w:rFonts w:hint="eastAsia"/>
         </w:rPr>
-        <w:t>图</w:t>
-      </w:r>
-      <w:r>
-        <w:rPr>
-          <w:rFonts w:hint="eastAsia"/>
-        </w:rPr>
-        <w:t>3</w:t>
-      </w:r>
-      <w:r>
-        <w:t xml:space="preserve"> </w:t>
-      </w:r>
-      <w:r>
-        <w:rPr>
-          <w:rFonts w:hint="eastAsia"/>
-        </w:rPr>
         <w:t>S</w:t>
       </w:r>
       <w:r>
@@ -1798,10 +1753,10 @@
         </w:rPr>
         <w:lastRenderedPageBreak/>
         <w:drawing>
-          <wp:inline distT="0" distB="0" distL="0" distR="0" wp14:anchorId="5806EF96" wp14:editId="1D2227DC">
+          <wp:inline distT="0" distB="0" distL="0" distR="0" wp14:anchorId="49DBBCD1" wp14:editId="0DE77D03">
             <wp:extent cx="5334000" cy="4440530"/>
             <wp:effectExtent l="0" t="0" r="0" b="0"/>
-            <wp:docPr id="20" name="Picture" descr="图4 T组不同总剂量下的转移特性（线性坐标）"/>
+            <wp:docPr id="20" name="Picture" descr="T组不同总剂量下的转移特性（线性坐标）"/>
             <wp:cNvGraphicFramePr/>
             <a:graphic xmlns:a="http://schemas.openxmlformats.org/drawingml/2006/main">
               <a:graphicData uri="http://schemas.openxmlformats.org/drawingml/2006/picture">
@@ -1848,21 +1803,6 @@
         <w:rPr>
           <w:rFonts w:hint="eastAsia"/>
         </w:rPr>
-        <w:t>图</w:t>
-      </w:r>
-      <w:r>
-        <w:rPr>
-          <w:rFonts w:hint="eastAsia"/>
-        </w:rPr>
-        <w:t>4</w:t>
-      </w:r>
-      <w:r>
-        <w:t xml:space="preserve"> </w:t>
-      </w:r>
-      <w:r>
-        <w:rPr>
-          <w:rFonts w:hint="eastAsia"/>
-        </w:rPr>
         <w:t>T</w:t>
       </w:r>
       <w:r>
@@ -1882,10 +1822,10 @@
         </w:rPr>
         <w:lastRenderedPageBreak/>
         <w:drawing>
-          <wp:inline distT="0" distB="0" distL="0" distR="0" wp14:anchorId="425FD8A5" wp14:editId="720714D8">
+          <wp:inline distT="0" distB="0" distL="0" distR="0" wp14:anchorId="04B3A2D3" wp14:editId="7A7A3E1C">
             <wp:extent cx="5334000" cy="4354429"/>
             <wp:effectExtent l="0" t="0" r="0" b="0"/>
-            <wp:docPr id="23" name="Picture" descr="图5 T组不同总剂量下的转移特性（半对数坐标）"/>
+            <wp:docPr id="23" name="Picture" descr="T组不同总剂量下的转移特性（半对数坐标）"/>
             <wp:cNvGraphicFramePr/>
             <a:graphic xmlns:a="http://schemas.openxmlformats.org/drawingml/2006/main">
               <a:graphicData uri="http://schemas.openxmlformats.org/drawingml/2006/picture">
@@ -1932,21 +1872,6 @@
         <w:rPr>
           <w:rFonts w:hint="eastAsia"/>
         </w:rPr>
-        <w:t>图</w:t>
-      </w:r>
-      <w:r>
-        <w:rPr>
-          <w:rFonts w:hint="eastAsia"/>
-        </w:rPr>
-        <w:t>5</w:t>
-      </w:r>
-      <w:r>
-        <w:t xml:space="preserve"> </w:t>
-      </w:r>
-      <w:r>
-        <w:rPr>
-          <w:rFonts w:hint="eastAsia"/>
-        </w:rPr>
         <w:t>T</w:t>
       </w:r>
       <w:r>
@@ -1966,10 +1891,10 @@
         </w:rPr>
         <w:lastRenderedPageBreak/>
         <w:drawing>
-          <wp:inline distT="0" distB="0" distL="0" distR="0" wp14:anchorId="14B799AF" wp14:editId="628F81C0">
+          <wp:inline distT="0" distB="0" distL="0" distR="0" wp14:anchorId="3EADA09F" wp14:editId="25F7D5B2">
             <wp:extent cx="5334000" cy="3546760"/>
             <wp:effectExtent l="0" t="0" r="0" b="0"/>
-            <wp:docPr id="26" name="Picture" descr="图6 T组不同总剂量下的输出特性（VGS=-20 V，半对数坐标）"/>
+            <wp:docPr id="26" name="Picture" descr="T组不同总剂量下的输出特性（VGS=-20 V，半对数坐标）"/>
             <wp:cNvGraphicFramePr/>
             <a:graphic xmlns:a="http://schemas.openxmlformats.org/drawingml/2006/main">
               <a:graphicData uri="http://schemas.openxmlformats.org/drawingml/2006/picture">
@@ -2016,21 +1941,6 @@
         <w:rPr>
           <w:rFonts w:hint="eastAsia"/>
         </w:rPr>
-        <w:t>图</w:t>
-      </w:r>
-      <w:r>
-        <w:rPr>
-          <w:rFonts w:hint="eastAsia"/>
-        </w:rPr>
-        <w:t>6</w:t>
-      </w:r>
-      <w:r>
-        <w:t xml:space="preserve"> </w:t>
-      </w:r>
-      <w:r>
-        <w:rPr>
-          <w:rFonts w:hint="eastAsia"/>
-        </w:rPr>
         <w:t>T</w:t>
       </w:r>
       <w:r>
@@ -3607,10 +3517,10 @@
           <w:noProof/>
         </w:rPr>
         <w:drawing>
-          <wp:inline distT="0" distB="0" distL="0" distR="0" wp14:anchorId="36717EEA" wp14:editId="3B1E9A85">
+          <wp:inline distT="0" distB="0" distL="0" distR="0" wp14:anchorId="2FCDD0A7" wp14:editId="05CA58FC">
             <wp:extent cx="5334000" cy="4729884"/>
             <wp:effectExtent l="0" t="0" r="0" b="0"/>
-            <wp:docPr id="32" name="Picture" descr="图7 S/T组阈值电压随总剂量的变化"/>
+            <wp:docPr id="32" name="Picture" descr="S/T组阈值电压随总剂量的变化"/>
             <wp:cNvGraphicFramePr/>
             <a:graphic xmlns:a="http://schemas.openxmlformats.org/drawingml/2006/main">
               <a:graphicData uri="http://schemas.openxmlformats.org/drawingml/2006/picture">
@@ -3657,21 +3567,6 @@
         <w:rPr>
           <w:rFonts w:hint="eastAsia"/>
         </w:rPr>
-        <w:t>图</w:t>
-      </w:r>
-      <w:r>
-        <w:rPr>
-          <w:rFonts w:hint="eastAsia"/>
-        </w:rPr>
-        <w:t>7</w:t>
-      </w:r>
-      <w:r>
-        <w:t xml:space="preserve"> </w:t>
-      </w:r>
-      <w:r>
-        <w:rPr>
-          <w:rFonts w:hint="eastAsia"/>
-        </w:rPr>
         <w:t>S/T</w:t>
       </w:r>
       <w:r>
@@ -3691,10 +3586,10 @@
         </w:rPr>
         <w:lastRenderedPageBreak/>
         <w:drawing>
-          <wp:inline distT="0" distB="0" distL="0" distR="0" wp14:anchorId="201AAD0C" wp14:editId="3A6D58D6">
+          <wp:inline distT="0" distB="0" distL="0" distR="0" wp14:anchorId="3EC46582" wp14:editId="0F76FB47">
             <wp:extent cx="5334000" cy="4687540"/>
             <wp:effectExtent l="0" t="0" r="0" b="0"/>
-            <wp:docPr id="35" name="Picture" descr="图8 S/T组相对0 krad(Si)的阈值电压漂移"/>
+            <wp:docPr id="35" name="Picture" descr="S/T组相对0 krad(Si)的阈值电压漂移"/>
             <wp:cNvGraphicFramePr/>
             <a:graphic xmlns:a="http://schemas.openxmlformats.org/drawingml/2006/main">
               <a:graphicData uri="http://schemas.openxmlformats.org/drawingml/2006/picture">
@@ -3741,21 +3636,6 @@
         <w:rPr>
           <w:rFonts w:hint="eastAsia"/>
         </w:rPr>
-        <w:t>图</w:t>
-      </w:r>
-      <w:r>
-        <w:rPr>
-          <w:rFonts w:hint="eastAsia"/>
-        </w:rPr>
-        <w:t>8</w:t>
-      </w:r>
-      <w:r>
-        <w:t xml:space="preserve"> </w:t>
-      </w:r>
-      <w:r>
-        <w:rPr>
-          <w:rFonts w:hint="eastAsia"/>
-        </w:rPr>
         <w:t>S/T</w:t>
       </w:r>
       <w:r>
@@ -4505,10 +4385,10 @@
         </w:rPr>
         <w:lastRenderedPageBreak/>
         <w:drawing>
-          <wp:inline distT="0" distB="0" distL="0" distR="0" wp14:anchorId="0FF5DB6B" wp14:editId="65EF4AE5">
+          <wp:inline distT="0" distB="0" distL="0" distR="0" wp14:anchorId="62929E78" wp14:editId="2DD64CF8">
             <wp:extent cx="5334000" cy="4687540"/>
             <wp:effectExtent l="0" t="0" r="0" b="0"/>
-            <wp:docPr id="39" name="Picture" descr="图9 S/T组峰值跨导相对变化随总剂量的变化"/>
+            <wp:docPr id="39" name="Picture" descr="S/T组峰值跨导相对变化随总剂量的变化"/>
             <wp:cNvGraphicFramePr/>
             <a:graphic xmlns:a="http://schemas.openxmlformats.org/drawingml/2006/main">
               <a:graphicData uri="http://schemas.openxmlformats.org/drawingml/2006/picture">
@@ -4555,21 +4435,6 @@
         <w:rPr>
           <w:rFonts w:hint="eastAsia"/>
         </w:rPr>
-        <w:t>图</w:t>
-      </w:r>
-      <w:r>
-        <w:rPr>
-          <w:rFonts w:hint="eastAsia"/>
-        </w:rPr>
-        <w:t>9</w:t>
-      </w:r>
-      <w:r>
-        <w:t xml:space="preserve"> </w:t>
-      </w:r>
-      <w:r>
-        <w:rPr>
-          <w:rFonts w:hint="eastAsia"/>
-        </w:rPr>
         <w:t>S/T</w:t>
       </w:r>
       <w:r>
@@ -4945,10 +4810,10 @@
         </w:rPr>
         <w:lastRenderedPageBreak/>
         <w:drawing>
-          <wp:inline distT="0" distB="0" distL="0" distR="0" wp14:anchorId="281927C8" wp14:editId="6817EF68">
+          <wp:inline distT="0" distB="0" distL="0" distR="0" wp14:anchorId="115384BD" wp14:editId="4C17F471">
             <wp:extent cx="5334000" cy="4584501"/>
             <wp:effectExtent l="0" t="0" r="0" b="0"/>
-            <wp:docPr id="42" name="Picture" descr="图10 S/T组亚阈值摆幅随总剂量的变化"/>
+            <wp:docPr id="42" name="Picture" descr="S/T组亚阈值摆幅随总剂量的变化"/>
             <wp:cNvGraphicFramePr/>
             <a:graphic xmlns:a="http://schemas.openxmlformats.org/drawingml/2006/main">
               <a:graphicData uri="http://schemas.openxmlformats.org/drawingml/2006/picture">
@@ -4995,21 +4860,6 @@
         <w:rPr>
           <w:rFonts w:hint="eastAsia"/>
         </w:rPr>
-        <w:t>图</w:t>
-      </w:r>
-      <w:r>
-        <w:rPr>
-          <w:rFonts w:hint="eastAsia"/>
-        </w:rPr>
-        <w:t>10</w:t>
-      </w:r>
-      <w:r>
-        <w:t xml:space="preserve"> </w:t>
-      </w:r>
-      <w:r>
-        <w:rPr>
-          <w:rFonts w:hint="eastAsia"/>
-        </w:rPr>
         <w:t>S/T</w:t>
       </w:r>
       <w:r>
@@ -6195,10 +6045,10 @@
           <w:noProof/>
         </w:rPr>
         <w:drawing>
-          <wp:inline distT="0" distB="0" distL="0" distR="0" wp14:anchorId="79485B1E" wp14:editId="67DC9524">
+          <wp:inline distT="0" distB="0" distL="0" distR="0" wp14:anchorId="4E096C37" wp14:editId="5A8959AA">
             <wp:extent cx="5334000" cy="4494166"/>
             <wp:effectExtent l="0" t="0" r="0" b="0"/>
-            <wp:docPr id="47" name="Picture" descr="图11 S/T组30 V漏电流随总剂量的变化"/>
+            <wp:docPr id="47" name="Picture" descr="S/T组30 V漏电流随总剂量的变化"/>
             <wp:cNvGraphicFramePr/>
             <a:graphic xmlns:a="http://schemas.openxmlformats.org/drawingml/2006/main">
               <a:graphicData uri="http://schemas.openxmlformats.org/drawingml/2006/picture">
@@ -6245,21 +6095,6 @@
         <w:rPr>
           <w:rFonts w:hint="eastAsia"/>
         </w:rPr>
-        <w:t>图</w:t>
-      </w:r>
-      <w:r>
-        <w:rPr>
-          <w:rFonts w:hint="eastAsia"/>
-        </w:rPr>
-        <w:t>11</w:t>
-      </w:r>
-      <w:r>
-        <w:t xml:space="preserve"> </w:t>
-      </w:r>
-      <w:r>
-        <w:rPr>
-          <w:rFonts w:hint="eastAsia"/>
-        </w:rPr>
         <w:t>S/T</w:t>
       </w:r>
       <w:r>
@@ -6668,10 +6503,10 @@
         </w:rPr>
         <w:lastRenderedPageBreak/>
         <w:drawing>
-          <wp:inline distT="0" distB="0" distL="0" distR="0" wp14:anchorId="1452810A" wp14:editId="3C2D12E2">
+          <wp:inline distT="0" distB="0" distL="0" distR="0" wp14:anchorId="6241A6DF" wp14:editId="0BABAA3B">
             <wp:extent cx="5334000" cy="4624023"/>
             <wp:effectExtent l="0" t="0" r="0" b="0"/>
-            <wp:docPr id="50" name="Picture" descr="图12 S/T组达到1 µA漏电流所需漏极电压随总剂量的变化"/>
+            <wp:docPr id="50" name="Picture" descr="S/T组达到1 µA漏电流所需漏极电压随总剂量的变化"/>
             <wp:cNvGraphicFramePr/>
             <a:graphic xmlns:a="http://schemas.openxmlformats.org/drawingml/2006/main">
               <a:graphicData uri="http://schemas.openxmlformats.org/drawingml/2006/picture">
@@ -6718,21 +6553,6 @@
         <w:rPr>
           <w:rFonts w:hint="eastAsia"/>
         </w:rPr>
-        <w:t>图</w:t>
-      </w:r>
-      <w:r>
-        <w:rPr>
-          <w:rFonts w:hint="eastAsia"/>
-        </w:rPr>
-        <w:t>12</w:t>
-      </w:r>
-      <w:r>
-        <w:t xml:space="preserve"> </w:t>
-      </w:r>
-      <w:r>
-        <w:rPr>
-          <w:rFonts w:hint="eastAsia"/>
-        </w:rPr>
         <w:t>S/T</w:t>
       </w:r>
       <w:r>
@@ -7664,10 +7484,10 @@
           <w:noProof/>
         </w:rPr>
         <w:drawing>
-          <wp:inline distT="0" distB="0" distL="0" distR="0" wp14:anchorId="283A2F0F" wp14:editId="5B2C2CD0">
+          <wp:inline distT="0" distB="0" distL="0" distR="0" wp14:anchorId="53AE5E84" wp14:editId="636CD9EC">
             <wp:extent cx="5334000" cy="4300793"/>
             <wp:effectExtent l="0" t="0" r="0" b="0"/>
-            <wp:docPr id="55" name="Picture" descr="图13 S组连续加压扫描后30 V漏电流相对首次扫描的降低"/>
+            <wp:docPr id="55" name="Picture" descr="S组连续加压扫描后30 V漏电流相对首次扫描的降低"/>
             <wp:cNvGraphicFramePr/>
             <a:graphic xmlns:a="http://schemas.openxmlformats.org/drawingml/2006/main">
               <a:graphicData uri="http://schemas.openxmlformats.org/drawingml/2006/picture">
@@ -7710,21 +7530,6 @@
       <w:pPr>
         <w:pStyle w:val="ImageCaption"/>
       </w:pPr>
-      <w:r>
-        <w:rPr>
-          <w:rFonts w:hint="eastAsia"/>
-        </w:rPr>
-        <w:t>图</w:t>
-      </w:r>
-      <w:r>
-        <w:rPr>
-          <w:rFonts w:hint="eastAsia"/>
-        </w:rPr>
-        <w:t>13</w:t>
-      </w:r>
-      <w:r>
-        <w:t xml:space="preserve"> </w:t>
-      </w:r>
       <w:r>
         <w:rPr>
           <w:rFonts w:hint="eastAsia"/>
@@ -9264,7 +9069,7 @@
   <w:abstractNum w:abstractNumId="0" w15:restartNumberingAfterBreak="0">
     <w:nsid w:val="0000A990"/>
     <w:multiLevelType w:val="multilevel"/>
-    <w:tmpl w:val="DB805F70"/>
+    <w:tmpl w:val="9F18CFFA"/>
     <w:lvl w:ilvl="0">
       <w:numFmt w:val="bullet"/>
       <w:lvlText w:val=" "/>
@@ -9341,7 +9146,7 @@
   <w:abstractNum w:abstractNumId="1" w15:restartNumberingAfterBreak="0">
     <w:nsid w:val="00A99411"/>
     <w:multiLevelType w:val="multilevel"/>
-    <w:tmpl w:val="ADBED72A"/>
+    <w:tmpl w:val="A3D0E7C6"/>
     <w:lvl w:ilvl="0">
       <w:start w:val="1"/>
       <w:numFmt w:val="decimal"/>
@@ -9424,10 +9229,10 @@
       </w:pPr>
     </w:lvl>
   </w:abstractNum>
-  <w:num w:numId="1" w16cid:durableId="114718774">
+  <w:num w:numId="1" w16cid:durableId="1466123527">
     <w:abstractNumId w:val="0"/>
   </w:num>
-  <w:num w:numId="2" w16cid:durableId="1116219399">
+  <w:num w:numId="2" w16cid:durableId="1670019697">
     <w:abstractNumId w:val="1"/>
     <w:lvlOverride w:ilvl="0">
       <w:startOverride w:val="1"/>
@@ -9457,7 +9262,7 @@
       <w:startOverride w:val="1"/>
     </w:lvlOverride>
   </w:num>
-  <w:num w:numId="3" w16cid:durableId="116802046">
+  <w:num w:numId="3" w16cid:durableId="515264891">
     <w:abstractNumId w:val="1"/>
     <w:lvlOverride w:ilvl="0">
       <w:startOverride w:val="1"/>
@@ -10722,7 +10527,7 @@
     <w:name w:val="header"/>
     <w:basedOn w:val="a"/>
     <w:link w:val="af1"/>
-    <w:rsid w:val="00A13CDC"/>
+    <w:rsid w:val="003D3A6A"/>
     <w:pPr>
       <w:tabs>
         <w:tab w:val="center" w:pos="4513"/>
@@ -10740,7 +10545,7 @@
     <w:name w:val="页眉 字符"/>
     <w:basedOn w:val="a1"/>
     <w:link w:val="af0"/>
-    <w:rsid w:val="00A13CDC"/>
+    <w:rsid w:val="003D3A6A"/>
     <w:rPr>
       <w:sz w:val="18"/>
       <w:szCs w:val="18"/>
@@ -10750,7 +10555,7 @@
     <w:name w:val="footer"/>
     <w:basedOn w:val="a"/>
     <w:link w:val="af3"/>
-    <w:rsid w:val="00A13CDC"/>
+    <w:rsid w:val="003D3A6A"/>
     <w:pPr>
       <w:tabs>
         <w:tab w:val="center" w:pos="4513"/>
@@ -10767,7 +10572,7 @@
     <w:name w:val="页脚 字符"/>
     <w:basedOn w:val="a1"/>
     <w:link w:val="af2"/>
-    <w:rsid w:val="00A13CDC"/>
+    <w:rsid w:val="003D3A6A"/>
     <w:rPr>
       <w:sz w:val="18"/>
       <w:szCs w:val="18"/>

</xml_diff>

<commit_message>
Sync finalized report files
Co-authored-by: Cursor <cursoragent@cursor.com>
</commit_message>
<xml_diff>
--- a/deliverables/04_manuscript/report.docx
+++ b/deliverables/04_manuscript/report.docx
@@ -1525,7 +1525,7 @@
           <w:noProof/>
         </w:rPr>
         <w:drawing>
-          <wp:inline distT="0" distB="0" distL="0" distR="0" wp14:anchorId="323C009A" wp14:editId="42EFE564">
+          <wp:inline distT="0" distB="0" distL="0" distR="0" wp14:anchorId="01ADA6FC" wp14:editId="7DEBCCE3">
             <wp:extent cx="5334000" cy="4440530"/>
             <wp:effectExtent l="0" t="0" r="0" b="0"/>
             <wp:docPr id="11" name="Picture" descr="S组不同总剂量下的转移特性（线性坐标）"/>
@@ -1569,30 +1569,68 @@
     </w:p>
     <w:p>
       <w:pPr>
-        <w:pStyle w:val="ImageCaption"/>
-        <w:jc w:val="center"/>
-        <w:rPr>
-          <w:sz w:val="18"/>
-        </w:rPr>
-      </w:pPr>
-      <w:r>
-        <w:rPr>
-          <w:rFonts w:hint="eastAsia"/>
-          <w:sz w:val="18"/>
+        <w:pStyle w:val="ac"/>
+      </w:pPr>
+      <w:r>
+        <w:rPr>
+          <w:rFonts w:hint="eastAsia"/>
         </w:rPr>
         <w:t>图</w:t>
       </w:r>
       <w:r>
         <w:rPr>
           <w:rFonts w:hint="eastAsia"/>
-          <w:sz w:val="18"/>
-        </w:rPr>
-        <w:t>1 S</w:t>
-      </w:r>
-      <w:r>
-        <w:rPr>
-          <w:rFonts w:hint="eastAsia"/>
-          <w:sz w:val="18"/>
+        </w:rPr>
+        <w:t xml:space="preserve"> </w:t>
+      </w:r>
+      <w:r>
+        <w:fldChar w:fldCharType="begin"/>
+      </w:r>
+      <w:r>
+        <w:instrText xml:space="preserve"> </w:instrText>
+      </w:r>
+      <w:r>
+        <w:rPr>
+          <w:rFonts w:hint="eastAsia"/>
+        </w:rPr>
+        <w:instrText xml:space="preserve">SEQ </w:instrText>
+      </w:r>
+      <w:r>
+        <w:rPr>
+          <w:rFonts w:hint="eastAsia"/>
+        </w:rPr>
+        <w:instrText>图</w:instrText>
+      </w:r>
+      <w:r>
+        <w:rPr>
+          <w:rFonts w:hint="eastAsia"/>
+        </w:rPr>
+        <w:instrText xml:space="preserve"> \* ARABIC</w:instrText>
+      </w:r>
+      <w:r>
+        <w:instrText xml:space="preserve"> </w:instrText>
+      </w:r>
+      <w:r>
+        <w:fldChar w:fldCharType="separate"/>
+      </w:r>
+      <w:r>
+        <w:rPr>
+          <w:noProof/>
+        </w:rPr>
+        <w:t>1</w:t>
+      </w:r>
+      <w:r>
+        <w:fldChar w:fldCharType="end"/>
+      </w:r>
+      <w:r>
+        <w:rPr>
+          <w:rFonts w:hint="eastAsia"/>
+        </w:rPr>
+        <w:t xml:space="preserve"> S</w:t>
+      </w:r>
+      <w:r>
+        <w:rPr>
+          <w:rFonts w:hint="eastAsia"/>
         </w:rPr>
         <w:t>组不同总剂量下的转移特性（线性坐标）</w:t>
       </w:r>
@@ -1624,7 +1662,7 @@
         </w:rPr>
         <w:lastRenderedPageBreak/>
         <w:drawing>
-          <wp:inline distT="0" distB="0" distL="0" distR="0" wp14:anchorId="0840182E" wp14:editId="1DEC50F0">
+          <wp:inline distT="0" distB="0" distL="0" distR="0" wp14:anchorId="5A201B46" wp14:editId="1CC3321C">
             <wp:extent cx="5334000" cy="4354429"/>
             <wp:effectExtent l="0" t="0" r="0" b="0"/>
             <wp:docPr id="14" name="Picture" descr="S组不同总剂量下的转移特性（半对数坐标）"/>
@@ -1668,30 +1706,68 @@
     </w:p>
     <w:p>
       <w:pPr>
-        <w:pStyle w:val="ImageCaption"/>
-        <w:jc w:val="center"/>
-        <w:rPr>
-          <w:sz w:val="18"/>
-        </w:rPr>
-      </w:pPr>
-      <w:r>
-        <w:rPr>
-          <w:rFonts w:hint="eastAsia"/>
-          <w:sz w:val="18"/>
+        <w:pStyle w:val="ac"/>
+      </w:pPr>
+      <w:r>
+        <w:rPr>
+          <w:rFonts w:hint="eastAsia"/>
         </w:rPr>
         <w:t>图</w:t>
       </w:r>
       <w:r>
         <w:rPr>
           <w:rFonts w:hint="eastAsia"/>
-          <w:sz w:val="18"/>
-        </w:rPr>
-        <w:t>2 S</w:t>
-      </w:r>
-      <w:r>
-        <w:rPr>
-          <w:rFonts w:hint="eastAsia"/>
-          <w:sz w:val="18"/>
+        </w:rPr>
+        <w:t xml:space="preserve"> </w:t>
+      </w:r>
+      <w:r>
+        <w:fldChar w:fldCharType="begin"/>
+      </w:r>
+      <w:r>
+        <w:instrText xml:space="preserve"> </w:instrText>
+      </w:r>
+      <w:r>
+        <w:rPr>
+          <w:rFonts w:hint="eastAsia"/>
+        </w:rPr>
+        <w:instrText xml:space="preserve">SEQ </w:instrText>
+      </w:r>
+      <w:r>
+        <w:rPr>
+          <w:rFonts w:hint="eastAsia"/>
+        </w:rPr>
+        <w:instrText>图</w:instrText>
+      </w:r>
+      <w:r>
+        <w:rPr>
+          <w:rFonts w:hint="eastAsia"/>
+        </w:rPr>
+        <w:instrText xml:space="preserve"> \* ARABIC</w:instrText>
+      </w:r>
+      <w:r>
+        <w:instrText xml:space="preserve"> </w:instrText>
+      </w:r>
+      <w:r>
+        <w:fldChar w:fldCharType="separate"/>
+      </w:r>
+      <w:r>
+        <w:rPr>
+          <w:noProof/>
+        </w:rPr>
+        <w:t>2</w:t>
+      </w:r>
+      <w:r>
+        <w:fldChar w:fldCharType="end"/>
+      </w:r>
+      <w:r>
+        <w:rPr>
+          <w:rFonts w:hint="eastAsia"/>
+        </w:rPr>
+        <w:t xml:space="preserve"> S</w:t>
+      </w:r>
+      <w:r>
+        <w:rPr>
+          <w:rFonts w:hint="eastAsia"/>
         </w:rPr>
         <w:t>组不同总剂量下的转移特性（半对数坐标）</w:t>
       </w:r>
@@ -1723,7 +1799,7 @@
         </w:rPr>
         <w:lastRenderedPageBreak/>
         <w:drawing>
-          <wp:inline distT="0" distB="0" distL="0" distR="0" wp14:anchorId="0DE9D1D2" wp14:editId="5E231577">
+          <wp:inline distT="0" distB="0" distL="0" distR="0" wp14:anchorId="0766224F" wp14:editId="743EE4C6">
             <wp:extent cx="5334000" cy="3546760"/>
             <wp:effectExtent l="0" t="0" r="0" b="0"/>
             <wp:docPr id="17" name="Picture" descr="S组不同总剂量下的输出特性（VGS=-20 V，半对数坐标）"/>
@@ -1767,44 +1843,80 @@
     </w:p>
     <w:p>
       <w:pPr>
-        <w:pStyle w:val="ImageCaption"/>
-        <w:jc w:val="center"/>
-        <w:rPr>
-          <w:sz w:val="18"/>
-        </w:rPr>
-      </w:pPr>
-      <w:r>
-        <w:rPr>
-          <w:rFonts w:hint="eastAsia"/>
-          <w:sz w:val="18"/>
+        <w:pStyle w:val="ac"/>
+      </w:pPr>
+      <w:r>
+        <w:rPr>
+          <w:rFonts w:hint="eastAsia"/>
         </w:rPr>
         <w:t>图</w:t>
       </w:r>
       <w:r>
         <w:rPr>
           <w:rFonts w:hint="eastAsia"/>
-          <w:sz w:val="18"/>
-        </w:rPr>
-        <w:t>3 S</w:t>
-      </w:r>
-      <w:r>
-        <w:rPr>
-          <w:rFonts w:hint="eastAsia"/>
-          <w:sz w:val="18"/>
+        </w:rPr>
+        <w:t xml:space="preserve"> </w:t>
+      </w:r>
+      <w:r>
+        <w:fldChar w:fldCharType="begin"/>
+      </w:r>
+      <w:r>
+        <w:instrText xml:space="preserve"> </w:instrText>
+      </w:r>
+      <w:r>
+        <w:rPr>
+          <w:rFonts w:hint="eastAsia"/>
+        </w:rPr>
+        <w:instrText xml:space="preserve">SEQ </w:instrText>
+      </w:r>
+      <w:r>
+        <w:rPr>
+          <w:rFonts w:hint="eastAsia"/>
+        </w:rPr>
+        <w:instrText>图</w:instrText>
+      </w:r>
+      <w:r>
+        <w:rPr>
+          <w:rFonts w:hint="eastAsia"/>
+        </w:rPr>
+        <w:instrText xml:space="preserve"> \* ARABIC</w:instrText>
+      </w:r>
+      <w:r>
+        <w:instrText xml:space="preserve"> </w:instrText>
+      </w:r>
+      <w:r>
+        <w:fldChar w:fldCharType="separate"/>
+      </w:r>
+      <w:r>
+        <w:rPr>
+          <w:noProof/>
+        </w:rPr>
+        <w:t>3</w:t>
+      </w:r>
+      <w:r>
+        <w:fldChar w:fldCharType="end"/>
+      </w:r>
+      <w:r>
+        <w:rPr>
+          <w:rFonts w:hint="eastAsia"/>
+        </w:rPr>
+        <w:t xml:space="preserve"> S</w:t>
+      </w:r>
+      <w:r>
+        <w:rPr>
+          <w:rFonts w:hint="eastAsia"/>
         </w:rPr>
         <w:t>组不同总剂量下的输出特性（</w:t>
       </w:r>
       <w:r>
         <w:rPr>
           <w:rFonts w:hint="eastAsia"/>
-          <w:sz w:val="18"/>
         </w:rPr>
         <w:t>VGS=-20 V</w:t>
       </w:r>
       <w:r>
         <w:rPr>
           <w:rFonts w:hint="eastAsia"/>
-          <w:sz w:val="18"/>
         </w:rPr>
         <w:t>，半对数坐标）</w:t>
       </w:r>
@@ -1857,7 +1969,7 @@
         </w:rPr>
         <w:lastRenderedPageBreak/>
         <w:drawing>
-          <wp:inline distT="0" distB="0" distL="0" distR="0" wp14:anchorId="02FB6E92" wp14:editId="02CD7F94">
+          <wp:inline distT="0" distB="0" distL="0" distR="0" wp14:anchorId="2BDB62FD" wp14:editId="1A713C7C">
             <wp:extent cx="5334000" cy="4440530"/>
             <wp:effectExtent l="0" t="0" r="0" b="0"/>
             <wp:docPr id="20" name="Picture" descr="T组不同总剂量下的转移特性（线性坐标）"/>
@@ -1901,30 +2013,68 @@
     </w:p>
     <w:p>
       <w:pPr>
-        <w:pStyle w:val="ImageCaption"/>
-        <w:jc w:val="center"/>
-        <w:rPr>
-          <w:sz w:val="18"/>
-        </w:rPr>
-      </w:pPr>
-      <w:r>
-        <w:rPr>
-          <w:rFonts w:hint="eastAsia"/>
-          <w:sz w:val="18"/>
+        <w:pStyle w:val="ac"/>
+      </w:pPr>
+      <w:r>
+        <w:rPr>
+          <w:rFonts w:hint="eastAsia"/>
         </w:rPr>
         <w:t>图</w:t>
       </w:r>
       <w:r>
         <w:rPr>
           <w:rFonts w:hint="eastAsia"/>
-          <w:sz w:val="18"/>
-        </w:rPr>
-        <w:t>4 T</w:t>
-      </w:r>
-      <w:r>
-        <w:rPr>
-          <w:rFonts w:hint="eastAsia"/>
-          <w:sz w:val="18"/>
+        </w:rPr>
+        <w:t xml:space="preserve"> </w:t>
+      </w:r>
+      <w:r>
+        <w:fldChar w:fldCharType="begin"/>
+      </w:r>
+      <w:r>
+        <w:instrText xml:space="preserve"> </w:instrText>
+      </w:r>
+      <w:r>
+        <w:rPr>
+          <w:rFonts w:hint="eastAsia"/>
+        </w:rPr>
+        <w:instrText xml:space="preserve">SEQ </w:instrText>
+      </w:r>
+      <w:r>
+        <w:rPr>
+          <w:rFonts w:hint="eastAsia"/>
+        </w:rPr>
+        <w:instrText>图</w:instrText>
+      </w:r>
+      <w:r>
+        <w:rPr>
+          <w:rFonts w:hint="eastAsia"/>
+        </w:rPr>
+        <w:instrText xml:space="preserve"> \* ARABIC</w:instrText>
+      </w:r>
+      <w:r>
+        <w:instrText xml:space="preserve"> </w:instrText>
+      </w:r>
+      <w:r>
+        <w:fldChar w:fldCharType="separate"/>
+      </w:r>
+      <w:r>
+        <w:rPr>
+          <w:noProof/>
+        </w:rPr>
+        <w:t>4</w:t>
+      </w:r>
+      <w:r>
+        <w:fldChar w:fldCharType="end"/>
+      </w:r>
+      <w:r>
+        <w:rPr>
+          <w:rFonts w:hint="eastAsia"/>
+        </w:rPr>
+        <w:t xml:space="preserve"> T</w:t>
+      </w:r>
+      <w:r>
+        <w:rPr>
+          <w:rFonts w:hint="eastAsia"/>
         </w:rPr>
         <w:t>组不同总剂量下的转移特性（线性坐标）</w:t>
       </w:r>
@@ -1956,7 +2106,7 @@
         </w:rPr>
         <w:lastRenderedPageBreak/>
         <w:drawing>
-          <wp:inline distT="0" distB="0" distL="0" distR="0" wp14:anchorId="20A40E83" wp14:editId="50CD757A">
+          <wp:inline distT="0" distB="0" distL="0" distR="0" wp14:anchorId="052A19D9" wp14:editId="3B2E412C">
             <wp:extent cx="5334000" cy="4354429"/>
             <wp:effectExtent l="0" t="0" r="0" b="0"/>
             <wp:docPr id="23" name="Picture" descr="T组不同总剂量下的转移特性（半对数坐标）"/>
@@ -2000,30 +2150,68 @@
     </w:p>
     <w:p>
       <w:pPr>
-        <w:pStyle w:val="ImageCaption"/>
-        <w:jc w:val="center"/>
-        <w:rPr>
-          <w:sz w:val="18"/>
-        </w:rPr>
-      </w:pPr>
-      <w:r>
-        <w:rPr>
-          <w:rFonts w:hint="eastAsia"/>
-          <w:sz w:val="18"/>
+        <w:pStyle w:val="ac"/>
+      </w:pPr>
+      <w:r>
+        <w:rPr>
+          <w:rFonts w:hint="eastAsia"/>
         </w:rPr>
         <w:t>图</w:t>
       </w:r>
       <w:r>
         <w:rPr>
           <w:rFonts w:hint="eastAsia"/>
-          <w:sz w:val="18"/>
-        </w:rPr>
-        <w:t>5 T</w:t>
-      </w:r>
-      <w:r>
-        <w:rPr>
-          <w:rFonts w:hint="eastAsia"/>
-          <w:sz w:val="18"/>
+        </w:rPr>
+        <w:t xml:space="preserve"> </w:t>
+      </w:r>
+      <w:r>
+        <w:fldChar w:fldCharType="begin"/>
+      </w:r>
+      <w:r>
+        <w:instrText xml:space="preserve"> </w:instrText>
+      </w:r>
+      <w:r>
+        <w:rPr>
+          <w:rFonts w:hint="eastAsia"/>
+        </w:rPr>
+        <w:instrText xml:space="preserve">SEQ </w:instrText>
+      </w:r>
+      <w:r>
+        <w:rPr>
+          <w:rFonts w:hint="eastAsia"/>
+        </w:rPr>
+        <w:instrText>图</w:instrText>
+      </w:r>
+      <w:r>
+        <w:rPr>
+          <w:rFonts w:hint="eastAsia"/>
+        </w:rPr>
+        <w:instrText xml:space="preserve"> \* ARABIC</w:instrText>
+      </w:r>
+      <w:r>
+        <w:instrText xml:space="preserve"> </w:instrText>
+      </w:r>
+      <w:r>
+        <w:fldChar w:fldCharType="separate"/>
+      </w:r>
+      <w:r>
+        <w:rPr>
+          <w:noProof/>
+        </w:rPr>
+        <w:t>5</w:t>
+      </w:r>
+      <w:r>
+        <w:fldChar w:fldCharType="end"/>
+      </w:r>
+      <w:r>
+        <w:rPr>
+          <w:rFonts w:hint="eastAsia"/>
+        </w:rPr>
+        <w:t xml:space="preserve"> T</w:t>
+      </w:r>
+      <w:r>
+        <w:rPr>
+          <w:rFonts w:hint="eastAsia"/>
         </w:rPr>
         <w:t>组不同总剂量下的转移特性（半对数坐标）</w:t>
       </w:r>
@@ -2055,7 +2243,7 @@
         </w:rPr>
         <w:lastRenderedPageBreak/>
         <w:drawing>
-          <wp:inline distT="0" distB="0" distL="0" distR="0" wp14:anchorId="75209CDD" wp14:editId="7F2EB86D">
+          <wp:inline distT="0" distB="0" distL="0" distR="0" wp14:anchorId="7886F652" wp14:editId="6CA4909D">
             <wp:extent cx="5334000" cy="3546760"/>
             <wp:effectExtent l="0" t="0" r="0" b="0"/>
             <wp:docPr id="26" name="Picture" descr="T组不同总剂量下的输出特性（VGS=-20 V，半对数坐标）"/>
@@ -2099,44 +2287,80 @@
     </w:p>
     <w:p>
       <w:pPr>
-        <w:pStyle w:val="ImageCaption"/>
-        <w:jc w:val="center"/>
-        <w:rPr>
-          <w:sz w:val="18"/>
-        </w:rPr>
-      </w:pPr>
-      <w:r>
-        <w:rPr>
-          <w:rFonts w:hint="eastAsia"/>
-          <w:sz w:val="18"/>
+        <w:pStyle w:val="ac"/>
+      </w:pPr>
+      <w:r>
+        <w:rPr>
+          <w:rFonts w:hint="eastAsia"/>
         </w:rPr>
         <w:t>图</w:t>
       </w:r>
       <w:r>
         <w:rPr>
           <w:rFonts w:hint="eastAsia"/>
-          <w:sz w:val="18"/>
-        </w:rPr>
-        <w:t>6 T</w:t>
-      </w:r>
-      <w:r>
-        <w:rPr>
-          <w:rFonts w:hint="eastAsia"/>
-          <w:sz w:val="18"/>
+        </w:rPr>
+        <w:t xml:space="preserve"> </w:t>
+      </w:r>
+      <w:r>
+        <w:fldChar w:fldCharType="begin"/>
+      </w:r>
+      <w:r>
+        <w:instrText xml:space="preserve"> </w:instrText>
+      </w:r>
+      <w:r>
+        <w:rPr>
+          <w:rFonts w:hint="eastAsia"/>
+        </w:rPr>
+        <w:instrText xml:space="preserve">SEQ </w:instrText>
+      </w:r>
+      <w:r>
+        <w:rPr>
+          <w:rFonts w:hint="eastAsia"/>
+        </w:rPr>
+        <w:instrText>图</w:instrText>
+      </w:r>
+      <w:r>
+        <w:rPr>
+          <w:rFonts w:hint="eastAsia"/>
+        </w:rPr>
+        <w:instrText xml:space="preserve"> \* ARABIC</w:instrText>
+      </w:r>
+      <w:r>
+        <w:instrText xml:space="preserve"> </w:instrText>
+      </w:r>
+      <w:r>
+        <w:fldChar w:fldCharType="separate"/>
+      </w:r>
+      <w:r>
+        <w:rPr>
+          <w:noProof/>
+        </w:rPr>
+        <w:t>6</w:t>
+      </w:r>
+      <w:r>
+        <w:fldChar w:fldCharType="end"/>
+      </w:r>
+      <w:r>
+        <w:rPr>
+          <w:rFonts w:hint="eastAsia"/>
+        </w:rPr>
+        <w:t xml:space="preserve"> T</w:t>
+      </w:r>
+      <w:r>
+        <w:rPr>
+          <w:rFonts w:hint="eastAsia"/>
         </w:rPr>
         <w:t>组不同总剂量下的输出特性（</w:t>
       </w:r>
       <w:r>
         <w:rPr>
           <w:rFonts w:hint="eastAsia"/>
-          <w:sz w:val="18"/>
         </w:rPr>
         <w:t>VGS=-20 V</w:t>
       </w:r>
       <w:r>
         <w:rPr>
           <w:rFonts w:hint="eastAsia"/>
-          <w:sz w:val="18"/>
         </w:rPr>
         <w:t>，半对数坐标）</w:t>
       </w:r>
@@ -3725,7 +3949,7 @@
           <w:noProof/>
         </w:rPr>
         <w:drawing>
-          <wp:inline distT="0" distB="0" distL="0" distR="0" wp14:anchorId="3E662E66" wp14:editId="710EE22F">
+          <wp:inline distT="0" distB="0" distL="0" distR="0" wp14:anchorId="004CB560" wp14:editId="19D6CB5D">
             <wp:extent cx="5334000" cy="4729884"/>
             <wp:effectExtent l="0" t="0" r="0" b="0"/>
             <wp:docPr id="32" name="Picture" descr="S/T组阈值电压随总剂量的变化"/>
@@ -3769,30 +3993,68 @@
     </w:p>
     <w:p>
       <w:pPr>
-        <w:pStyle w:val="ImageCaption"/>
-        <w:jc w:val="center"/>
-        <w:rPr>
-          <w:sz w:val="18"/>
-        </w:rPr>
-      </w:pPr>
-      <w:r>
-        <w:rPr>
-          <w:rFonts w:hint="eastAsia"/>
-          <w:sz w:val="18"/>
+        <w:pStyle w:val="ac"/>
+      </w:pPr>
+      <w:r>
+        <w:rPr>
+          <w:rFonts w:hint="eastAsia"/>
         </w:rPr>
         <w:t>图</w:t>
       </w:r>
       <w:r>
         <w:rPr>
           <w:rFonts w:hint="eastAsia"/>
-          <w:sz w:val="18"/>
-        </w:rPr>
-        <w:t>7 S/T</w:t>
-      </w:r>
-      <w:r>
-        <w:rPr>
-          <w:rFonts w:hint="eastAsia"/>
-          <w:sz w:val="18"/>
+        </w:rPr>
+        <w:t xml:space="preserve"> </w:t>
+      </w:r>
+      <w:r>
+        <w:fldChar w:fldCharType="begin"/>
+      </w:r>
+      <w:r>
+        <w:instrText xml:space="preserve"> </w:instrText>
+      </w:r>
+      <w:r>
+        <w:rPr>
+          <w:rFonts w:hint="eastAsia"/>
+        </w:rPr>
+        <w:instrText xml:space="preserve">SEQ </w:instrText>
+      </w:r>
+      <w:r>
+        <w:rPr>
+          <w:rFonts w:hint="eastAsia"/>
+        </w:rPr>
+        <w:instrText>图</w:instrText>
+      </w:r>
+      <w:r>
+        <w:rPr>
+          <w:rFonts w:hint="eastAsia"/>
+        </w:rPr>
+        <w:instrText xml:space="preserve"> \* ARABIC</w:instrText>
+      </w:r>
+      <w:r>
+        <w:instrText xml:space="preserve"> </w:instrText>
+      </w:r>
+      <w:r>
+        <w:fldChar w:fldCharType="separate"/>
+      </w:r>
+      <w:r>
+        <w:rPr>
+          <w:noProof/>
+        </w:rPr>
+        <w:t>7</w:t>
+      </w:r>
+      <w:r>
+        <w:fldChar w:fldCharType="end"/>
+      </w:r>
+      <w:r>
+        <w:rPr>
+          <w:rFonts w:hint="eastAsia"/>
+        </w:rPr>
+        <w:t xml:space="preserve"> S/T</w:t>
+      </w:r>
+      <w:r>
+        <w:rPr>
+          <w:rFonts w:hint="eastAsia"/>
         </w:rPr>
         <w:t>组阈值电压随总剂量的变化</w:t>
       </w:r>
@@ -3824,7 +4086,7 @@
         </w:rPr>
         <w:lastRenderedPageBreak/>
         <w:drawing>
-          <wp:inline distT="0" distB="0" distL="0" distR="0" wp14:anchorId="63080AD3" wp14:editId="46943444">
+          <wp:inline distT="0" distB="0" distL="0" distR="0" wp14:anchorId="60447E0F" wp14:editId="3EA4F466">
             <wp:extent cx="5334000" cy="4687540"/>
             <wp:effectExtent l="0" t="0" r="0" b="0"/>
             <wp:docPr id="35" name="Picture" descr="S/T组相对0 krad(Si)的阈值电压漂移"/>
@@ -3868,44 +4130,80 @@
     </w:p>
     <w:p>
       <w:pPr>
-        <w:pStyle w:val="ImageCaption"/>
-        <w:jc w:val="center"/>
-        <w:rPr>
-          <w:sz w:val="18"/>
-        </w:rPr>
-      </w:pPr>
-      <w:r>
-        <w:rPr>
-          <w:rFonts w:hint="eastAsia"/>
-          <w:sz w:val="18"/>
+        <w:pStyle w:val="ac"/>
+      </w:pPr>
+      <w:r>
+        <w:rPr>
+          <w:rFonts w:hint="eastAsia"/>
         </w:rPr>
         <w:t>图</w:t>
       </w:r>
       <w:r>
         <w:rPr>
           <w:rFonts w:hint="eastAsia"/>
-          <w:sz w:val="18"/>
-        </w:rPr>
-        <w:t>8 S/T</w:t>
-      </w:r>
-      <w:r>
-        <w:rPr>
-          <w:rFonts w:hint="eastAsia"/>
-          <w:sz w:val="18"/>
+        </w:rPr>
+        <w:t xml:space="preserve"> </w:t>
+      </w:r>
+      <w:r>
+        <w:fldChar w:fldCharType="begin"/>
+      </w:r>
+      <w:r>
+        <w:instrText xml:space="preserve"> </w:instrText>
+      </w:r>
+      <w:r>
+        <w:rPr>
+          <w:rFonts w:hint="eastAsia"/>
+        </w:rPr>
+        <w:instrText xml:space="preserve">SEQ </w:instrText>
+      </w:r>
+      <w:r>
+        <w:rPr>
+          <w:rFonts w:hint="eastAsia"/>
+        </w:rPr>
+        <w:instrText>图</w:instrText>
+      </w:r>
+      <w:r>
+        <w:rPr>
+          <w:rFonts w:hint="eastAsia"/>
+        </w:rPr>
+        <w:instrText xml:space="preserve"> \* ARABIC</w:instrText>
+      </w:r>
+      <w:r>
+        <w:instrText xml:space="preserve"> </w:instrText>
+      </w:r>
+      <w:r>
+        <w:fldChar w:fldCharType="separate"/>
+      </w:r>
+      <w:r>
+        <w:rPr>
+          <w:noProof/>
+        </w:rPr>
+        <w:t>8</w:t>
+      </w:r>
+      <w:r>
+        <w:fldChar w:fldCharType="end"/>
+      </w:r>
+      <w:r>
+        <w:rPr>
+          <w:rFonts w:hint="eastAsia"/>
+        </w:rPr>
+        <w:t xml:space="preserve"> S/T</w:t>
+      </w:r>
+      <w:r>
+        <w:rPr>
+          <w:rFonts w:hint="eastAsia"/>
         </w:rPr>
         <w:t>组相对</w:t>
       </w:r>
       <w:r>
         <w:rPr>
           <w:rFonts w:hint="eastAsia"/>
-          <w:sz w:val="18"/>
         </w:rPr>
         <w:t>0 krad(Si)</w:t>
       </w:r>
       <w:r>
         <w:rPr>
           <w:rFonts w:hint="eastAsia"/>
-          <w:sz w:val="18"/>
         </w:rPr>
         <w:t>的阈值电压漂移</w:t>
       </w:r>
@@ -3961,7 +4259,10 @@
         <w:t>统计归纳：</w:t>
       </w:r>
       <w:r>
-        <w:t xml:space="preserve"> 60 krad(Si) </w:t>
+        <w:t xml:space="preserve"> </w:t>
+      </w:r>
+      <w:r>
+        <w:t xml:space="preserve">60 krad(Si) </w:t>
       </w:r>
       <w:r>
         <w:rPr>
@@ -4446,7 +4747,16 @@
           <w:rPr>
             <w:rFonts w:ascii="Cambria Math" w:hAnsi="Cambria Math"/>
           </w:rPr>
-          <m:t>-(</m:t>
+          <m:t>-</m:t>
+        </m:r>
+        <m:r>
+          <m:rPr>
+            <m:sty m:val="p"/>
+          </m:rPr>
+          <w:rPr>
+            <w:rFonts w:ascii="Cambria Math" w:hAnsi="Cambria Math"/>
+          </w:rPr>
+          <m:t>(</m:t>
         </m:r>
         <m:r>
           <w:rPr>
@@ -4587,7 +4897,16 @@
           <w:rPr>
             <w:rFonts w:ascii="Cambria Math" w:hAnsi="Cambria Math"/>
           </w:rPr>
-          <m:t>-(</m:t>
+          <m:t>-</m:t>
+        </m:r>
+        <m:r>
+          <m:rPr>
+            <m:sty m:val="p"/>
+          </m:rPr>
+          <w:rPr>
+            <w:rFonts w:ascii="Cambria Math" w:hAnsi="Cambria Math"/>
+          </w:rPr>
+          <m:t>(</m:t>
         </m:r>
         <m:r>
           <w:rPr>
@@ -4667,7 +4986,7 @@
         </w:rPr>
         <w:lastRenderedPageBreak/>
         <w:drawing>
-          <wp:inline distT="0" distB="0" distL="0" distR="0" wp14:anchorId="3EA5F8F5" wp14:editId="004CAA32">
+          <wp:inline distT="0" distB="0" distL="0" distR="0" wp14:anchorId="5940CF22" wp14:editId="265742A4">
             <wp:extent cx="5334000" cy="4687540"/>
             <wp:effectExtent l="0" t="0" r="0" b="0"/>
             <wp:docPr id="39" name="Picture" descr="S/T组峰值跨导相对变化随总剂量的变化"/>
@@ -4711,30 +5030,68 @@
     </w:p>
     <w:p>
       <w:pPr>
-        <w:pStyle w:val="ImageCaption"/>
-        <w:jc w:val="center"/>
-        <w:rPr>
-          <w:sz w:val="18"/>
-        </w:rPr>
-      </w:pPr>
-      <w:r>
-        <w:rPr>
-          <w:rFonts w:hint="eastAsia"/>
-          <w:sz w:val="18"/>
+        <w:pStyle w:val="ac"/>
+      </w:pPr>
+      <w:r>
+        <w:rPr>
+          <w:rFonts w:hint="eastAsia"/>
         </w:rPr>
         <w:t>图</w:t>
       </w:r>
       <w:r>
         <w:rPr>
           <w:rFonts w:hint="eastAsia"/>
-          <w:sz w:val="18"/>
-        </w:rPr>
-        <w:t>9 S/T</w:t>
-      </w:r>
-      <w:r>
-        <w:rPr>
-          <w:rFonts w:hint="eastAsia"/>
-          <w:sz w:val="18"/>
+        </w:rPr>
+        <w:t xml:space="preserve"> </w:t>
+      </w:r>
+      <w:r>
+        <w:fldChar w:fldCharType="begin"/>
+      </w:r>
+      <w:r>
+        <w:instrText xml:space="preserve"> </w:instrText>
+      </w:r>
+      <w:r>
+        <w:rPr>
+          <w:rFonts w:hint="eastAsia"/>
+        </w:rPr>
+        <w:instrText xml:space="preserve">SEQ </w:instrText>
+      </w:r>
+      <w:r>
+        <w:rPr>
+          <w:rFonts w:hint="eastAsia"/>
+        </w:rPr>
+        <w:instrText>图</w:instrText>
+      </w:r>
+      <w:r>
+        <w:rPr>
+          <w:rFonts w:hint="eastAsia"/>
+        </w:rPr>
+        <w:instrText xml:space="preserve"> \* ARABIC</w:instrText>
+      </w:r>
+      <w:r>
+        <w:instrText xml:space="preserve"> </w:instrText>
+      </w:r>
+      <w:r>
+        <w:fldChar w:fldCharType="separate"/>
+      </w:r>
+      <w:r>
+        <w:rPr>
+          <w:noProof/>
+        </w:rPr>
+        <w:t>9</w:t>
+      </w:r>
+      <w:r>
+        <w:fldChar w:fldCharType="end"/>
+      </w:r>
+      <w:r>
+        <w:rPr>
+          <w:rFonts w:hint="eastAsia"/>
+        </w:rPr>
+        <w:t xml:space="preserve"> S/T</w:t>
+      </w:r>
+      <w:r>
+        <w:rPr>
+          <w:rFonts w:hint="eastAsia"/>
         </w:rPr>
         <w:t>组峰值跨导相对变化随总剂量的变化</w:t>
       </w:r>
@@ -4896,7 +5253,10 @@
         </m:r>
       </m:oMath>
       <w:r>
-        <w:t xml:space="preserve"> mV/dec</w:t>
+        <w:t xml:space="preserve"> </w:t>
+      </w:r>
+      <w:r>
+        <w:t>mV/dec</w:t>
       </w:r>
       <w:r>
         <w:t>。</w:t>
@@ -5122,7 +5482,7 @@
         </w:rPr>
         <w:lastRenderedPageBreak/>
         <w:drawing>
-          <wp:inline distT="0" distB="0" distL="0" distR="0" wp14:anchorId="1829F5D1" wp14:editId="1CC80881">
+          <wp:inline distT="0" distB="0" distL="0" distR="0" wp14:anchorId="7CA447A5" wp14:editId="455D7C61">
             <wp:extent cx="5334000" cy="4584501"/>
             <wp:effectExtent l="0" t="0" r="0" b="0"/>
             <wp:docPr id="42" name="Picture" descr="S/T组亚阈值摆幅随总剂量的变化"/>
@@ -5166,30 +5526,68 @@
     </w:p>
     <w:p>
       <w:pPr>
-        <w:pStyle w:val="ImageCaption"/>
-        <w:jc w:val="center"/>
-        <w:rPr>
-          <w:sz w:val="18"/>
-        </w:rPr>
-      </w:pPr>
-      <w:r>
-        <w:rPr>
-          <w:rFonts w:hint="eastAsia"/>
-          <w:sz w:val="18"/>
+        <w:pStyle w:val="ac"/>
+      </w:pPr>
+      <w:r>
+        <w:rPr>
+          <w:rFonts w:hint="eastAsia"/>
         </w:rPr>
         <w:t>图</w:t>
       </w:r>
       <w:r>
         <w:rPr>
           <w:rFonts w:hint="eastAsia"/>
-          <w:sz w:val="18"/>
-        </w:rPr>
-        <w:t>10 S/T</w:t>
-      </w:r>
-      <w:r>
-        <w:rPr>
-          <w:rFonts w:hint="eastAsia"/>
-          <w:sz w:val="18"/>
+        </w:rPr>
+        <w:t xml:space="preserve"> </w:t>
+      </w:r>
+      <w:r>
+        <w:fldChar w:fldCharType="begin"/>
+      </w:r>
+      <w:r>
+        <w:instrText xml:space="preserve"> </w:instrText>
+      </w:r>
+      <w:r>
+        <w:rPr>
+          <w:rFonts w:hint="eastAsia"/>
+        </w:rPr>
+        <w:instrText xml:space="preserve">SEQ </w:instrText>
+      </w:r>
+      <w:r>
+        <w:rPr>
+          <w:rFonts w:hint="eastAsia"/>
+        </w:rPr>
+        <w:instrText>图</w:instrText>
+      </w:r>
+      <w:r>
+        <w:rPr>
+          <w:rFonts w:hint="eastAsia"/>
+        </w:rPr>
+        <w:instrText xml:space="preserve"> \* ARABIC</w:instrText>
+      </w:r>
+      <w:r>
+        <w:instrText xml:space="preserve"> </w:instrText>
+      </w:r>
+      <w:r>
+        <w:fldChar w:fldCharType="separate"/>
+      </w:r>
+      <w:r>
+        <w:rPr>
+          <w:noProof/>
+        </w:rPr>
+        <w:t>10</w:t>
+      </w:r>
+      <w:r>
+        <w:fldChar w:fldCharType="end"/>
+      </w:r>
+      <w:r>
+        <w:rPr>
+          <w:rFonts w:hint="eastAsia"/>
+        </w:rPr>
+        <w:t xml:space="preserve"> S/T</w:t>
+      </w:r>
+      <w:r>
+        <w:rPr>
+          <w:rFonts w:hint="eastAsia"/>
         </w:rPr>
         <w:t>组亚阈值摆幅随总剂量的变化</w:t>
       </w:r>
@@ -6387,7 +6785,7 @@
           <w:noProof/>
         </w:rPr>
         <w:drawing>
-          <wp:inline distT="0" distB="0" distL="0" distR="0" wp14:anchorId="40FAF9D6" wp14:editId="774F62E7">
+          <wp:inline distT="0" distB="0" distL="0" distR="0" wp14:anchorId="2E795D65" wp14:editId="0100C276">
             <wp:extent cx="5334000" cy="4494166"/>
             <wp:effectExtent l="0" t="0" r="0" b="0"/>
             <wp:docPr id="47" name="Picture" descr="S/T组30 V漏电流随总剂量的变化"/>
@@ -6431,44 +6829,80 @@
     </w:p>
     <w:p>
       <w:pPr>
-        <w:pStyle w:val="ImageCaption"/>
-        <w:jc w:val="center"/>
-        <w:rPr>
-          <w:sz w:val="18"/>
-        </w:rPr>
-      </w:pPr>
-      <w:r>
-        <w:rPr>
-          <w:rFonts w:hint="eastAsia"/>
-          <w:sz w:val="18"/>
+        <w:pStyle w:val="ac"/>
+      </w:pPr>
+      <w:r>
+        <w:rPr>
+          <w:rFonts w:hint="eastAsia"/>
         </w:rPr>
         <w:t>图</w:t>
       </w:r>
       <w:r>
         <w:rPr>
           <w:rFonts w:hint="eastAsia"/>
-          <w:sz w:val="18"/>
-        </w:rPr>
-        <w:t>11 S/T</w:t>
-      </w:r>
-      <w:r>
-        <w:rPr>
-          <w:rFonts w:hint="eastAsia"/>
-          <w:sz w:val="18"/>
+        </w:rPr>
+        <w:t xml:space="preserve"> </w:t>
+      </w:r>
+      <w:r>
+        <w:fldChar w:fldCharType="begin"/>
+      </w:r>
+      <w:r>
+        <w:instrText xml:space="preserve"> </w:instrText>
+      </w:r>
+      <w:r>
+        <w:rPr>
+          <w:rFonts w:hint="eastAsia"/>
+        </w:rPr>
+        <w:instrText xml:space="preserve">SEQ </w:instrText>
+      </w:r>
+      <w:r>
+        <w:rPr>
+          <w:rFonts w:hint="eastAsia"/>
+        </w:rPr>
+        <w:instrText>图</w:instrText>
+      </w:r>
+      <w:r>
+        <w:rPr>
+          <w:rFonts w:hint="eastAsia"/>
+        </w:rPr>
+        <w:instrText xml:space="preserve"> \* ARABIC</w:instrText>
+      </w:r>
+      <w:r>
+        <w:instrText xml:space="preserve"> </w:instrText>
+      </w:r>
+      <w:r>
+        <w:fldChar w:fldCharType="separate"/>
+      </w:r>
+      <w:r>
+        <w:rPr>
+          <w:noProof/>
+        </w:rPr>
+        <w:t>11</w:t>
+      </w:r>
+      <w:r>
+        <w:fldChar w:fldCharType="end"/>
+      </w:r>
+      <w:r>
+        <w:rPr>
+          <w:rFonts w:hint="eastAsia"/>
+        </w:rPr>
+        <w:t xml:space="preserve"> S/T</w:t>
+      </w:r>
+      <w:r>
+        <w:rPr>
+          <w:rFonts w:hint="eastAsia"/>
         </w:rPr>
         <w:t>组</w:t>
       </w:r>
       <w:r>
         <w:rPr>
           <w:rFonts w:hint="eastAsia"/>
-          <w:sz w:val="18"/>
         </w:rPr>
         <w:t>30 V</w:t>
       </w:r>
       <w:r>
         <w:rPr>
           <w:rFonts w:hint="eastAsia"/>
-          <w:sz w:val="18"/>
         </w:rPr>
         <w:t>漏电流随总剂量的变化</w:t>
       </w:r>
@@ -6572,7 +7006,13 @@
           <w:rPr>
             <w:rFonts w:ascii="Cambria Math" w:hAnsi="Cambria Math"/>
           </w:rPr>
-          <m:t>1 μ</m:t>
+          <m:t>1 </m:t>
+        </m:r>
+        <m:r>
+          <w:rPr>
+            <w:rFonts w:ascii="Cambria Math" w:hAnsi="Cambria Math"/>
+          </w:rPr>
+          <m:t>μ</m:t>
         </m:r>
       </m:oMath>
       <w:r>
@@ -6889,7 +7329,7 @@
         </w:rPr>
         <w:lastRenderedPageBreak/>
         <w:drawing>
-          <wp:inline distT="0" distB="0" distL="0" distR="0" wp14:anchorId="3B9221CB" wp14:editId="7027358C">
+          <wp:inline distT="0" distB="0" distL="0" distR="0" wp14:anchorId="1530E962" wp14:editId="10761724">
             <wp:extent cx="5334000" cy="4624023"/>
             <wp:effectExtent l="0" t="0" r="0" b="0"/>
             <wp:docPr id="50" name="Picture" descr="S/T组达到1 µA漏电流所需漏极电压随总剂量的变化"/>
@@ -6933,44 +7373,80 @@
     </w:p>
     <w:p>
       <w:pPr>
-        <w:pStyle w:val="ImageCaption"/>
-        <w:jc w:val="center"/>
-        <w:rPr>
-          <w:sz w:val="18"/>
-        </w:rPr>
-      </w:pPr>
-      <w:r>
-        <w:rPr>
-          <w:rFonts w:hint="eastAsia"/>
-          <w:sz w:val="18"/>
+        <w:pStyle w:val="ac"/>
+      </w:pPr>
+      <w:r>
+        <w:rPr>
+          <w:rFonts w:hint="eastAsia"/>
         </w:rPr>
         <w:t>图</w:t>
       </w:r>
       <w:r>
         <w:rPr>
           <w:rFonts w:hint="eastAsia"/>
-          <w:sz w:val="18"/>
-        </w:rPr>
-        <w:t>12 S/T</w:t>
-      </w:r>
-      <w:r>
-        <w:rPr>
-          <w:rFonts w:hint="eastAsia"/>
-          <w:sz w:val="18"/>
+        </w:rPr>
+        <w:t xml:space="preserve"> </w:t>
+      </w:r>
+      <w:r>
+        <w:fldChar w:fldCharType="begin"/>
+      </w:r>
+      <w:r>
+        <w:instrText xml:space="preserve"> </w:instrText>
+      </w:r>
+      <w:r>
+        <w:rPr>
+          <w:rFonts w:hint="eastAsia"/>
+        </w:rPr>
+        <w:instrText xml:space="preserve">SEQ </w:instrText>
+      </w:r>
+      <w:r>
+        <w:rPr>
+          <w:rFonts w:hint="eastAsia"/>
+        </w:rPr>
+        <w:instrText>图</w:instrText>
+      </w:r>
+      <w:r>
+        <w:rPr>
+          <w:rFonts w:hint="eastAsia"/>
+        </w:rPr>
+        <w:instrText xml:space="preserve"> \* ARABIC</w:instrText>
+      </w:r>
+      <w:r>
+        <w:instrText xml:space="preserve"> </w:instrText>
+      </w:r>
+      <w:r>
+        <w:fldChar w:fldCharType="separate"/>
+      </w:r>
+      <w:r>
+        <w:rPr>
+          <w:noProof/>
+        </w:rPr>
+        <w:t>12</w:t>
+      </w:r>
+      <w:r>
+        <w:fldChar w:fldCharType="end"/>
+      </w:r>
+      <w:r>
+        <w:rPr>
+          <w:rFonts w:hint="eastAsia"/>
+        </w:rPr>
+        <w:t xml:space="preserve"> S/T</w:t>
+      </w:r>
+      <w:r>
+        <w:rPr>
+          <w:rFonts w:hint="eastAsia"/>
         </w:rPr>
         <w:t>组达到</w:t>
       </w:r>
       <w:r>
         <w:rPr>
           <w:rFonts w:hint="eastAsia"/>
-          <w:sz w:val="18"/>
         </w:rPr>
         <w:t>1 µA</w:t>
       </w:r>
       <w:r>
         <w:rPr>
           <w:rFonts w:hint="eastAsia"/>
-          <w:sz w:val="18"/>
         </w:rPr>
         <w:t>漏电流所需漏极电压随总剂量的变化</w:t>
       </w:r>
@@ -7921,7 +8397,7 @@
         </w:rPr>
         <w:lastRenderedPageBreak/>
         <w:drawing>
-          <wp:inline distT="0" distB="0" distL="0" distR="0" wp14:anchorId="2B3E1CAB" wp14:editId="08DE99AD">
+          <wp:inline distT="0" distB="0" distL="0" distR="0" wp14:anchorId="1D628A72" wp14:editId="686608BF">
             <wp:extent cx="5334000" cy="4300793"/>
             <wp:effectExtent l="0" t="0" r="0" b="0"/>
             <wp:docPr id="55" name="Picture" descr="S组连续加压扫描后30 V漏电流相对首次扫描的降低"/>
@@ -7965,44 +8441,80 @@
     </w:p>
     <w:p>
       <w:pPr>
-        <w:pStyle w:val="ImageCaption"/>
-        <w:jc w:val="center"/>
-        <w:rPr>
-          <w:sz w:val="18"/>
-        </w:rPr>
-      </w:pPr>
-      <w:r>
-        <w:rPr>
-          <w:rFonts w:hint="eastAsia"/>
-          <w:sz w:val="18"/>
+        <w:pStyle w:val="ac"/>
+      </w:pPr>
+      <w:r>
+        <w:rPr>
+          <w:rFonts w:hint="eastAsia"/>
         </w:rPr>
         <w:t>图</w:t>
       </w:r>
       <w:r>
         <w:rPr>
           <w:rFonts w:hint="eastAsia"/>
-          <w:sz w:val="18"/>
-        </w:rPr>
-        <w:t>13 S</w:t>
-      </w:r>
-      <w:r>
-        <w:rPr>
-          <w:rFonts w:hint="eastAsia"/>
-          <w:sz w:val="18"/>
+        </w:rPr>
+        <w:t xml:space="preserve"> </w:t>
+      </w:r>
+      <w:r>
+        <w:fldChar w:fldCharType="begin"/>
+      </w:r>
+      <w:r>
+        <w:instrText xml:space="preserve"> </w:instrText>
+      </w:r>
+      <w:r>
+        <w:rPr>
+          <w:rFonts w:hint="eastAsia"/>
+        </w:rPr>
+        <w:instrText xml:space="preserve">SEQ </w:instrText>
+      </w:r>
+      <w:r>
+        <w:rPr>
+          <w:rFonts w:hint="eastAsia"/>
+        </w:rPr>
+        <w:instrText>图</w:instrText>
+      </w:r>
+      <w:r>
+        <w:rPr>
+          <w:rFonts w:hint="eastAsia"/>
+        </w:rPr>
+        <w:instrText xml:space="preserve"> \* ARABIC</w:instrText>
+      </w:r>
+      <w:r>
+        <w:instrText xml:space="preserve"> </w:instrText>
+      </w:r>
+      <w:r>
+        <w:fldChar w:fldCharType="separate"/>
+      </w:r>
+      <w:r>
+        <w:rPr>
+          <w:noProof/>
+        </w:rPr>
+        <w:t>13</w:t>
+      </w:r>
+      <w:r>
+        <w:fldChar w:fldCharType="end"/>
+      </w:r>
+      <w:r>
+        <w:rPr>
+          <w:rFonts w:hint="eastAsia"/>
+        </w:rPr>
+        <w:t xml:space="preserve"> S</w:t>
+      </w:r>
+      <w:r>
+        <w:rPr>
+          <w:rFonts w:hint="eastAsia"/>
         </w:rPr>
         <w:t>组连续加压扫描后</w:t>
       </w:r>
       <w:r>
         <w:rPr>
           <w:rFonts w:hint="eastAsia"/>
-          <w:sz w:val="18"/>
         </w:rPr>
         <w:t>30 V</w:t>
       </w:r>
       <w:r>
         <w:rPr>
           <w:rFonts w:hint="eastAsia"/>
-          <w:sz w:val="18"/>
         </w:rPr>
         <w:t>漏电流相对首次扫描的降低</w:t>
       </w:r>
@@ -9448,7 +9960,12 @@
       <w:bookmarkEnd w:id="14"/>
     </w:p>
     <w:sectPr>
-      <w:footerReference w:type="default" r:id="rId20"/>
+      <w:headerReference w:type="even" r:id="rId20"/>
+      <w:headerReference w:type="default" r:id="rId21"/>
+      <w:footerReference w:type="even" r:id="rId22"/>
+      <w:footerReference w:type="default" r:id="rId23"/>
+      <w:headerReference w:type="first" r:id="rId24"/>
+      <w:footerReference w:type="first" r:id="rId25"/>
       <w:footnotePr>
         <w:numRestart w:val="eachSect"/>
       </w:footnotePr>
@@ -9487,6 +10004,16 @@
 </file>
 
 <file path=word/footer1.xml><?xml version="1.0" encoding="utf-8"?>
+<w:ftr xmlns:wpc="http://schemas.microsoft.com/office/word/2010/wordprocessingCanvas" xmlns:cx="http://schemas.microsoft.com/office/drawing/2014/chartex" xmlns:cx1="http://schemas.microsoft.com/office/drawing/2015/9/8/chartex" xmlns:cx2="http://schemas.microsoft.com/office/drawing/2015/10/21/chartex" xmlns:cx3="http://schemas.microsoft.com/office/drawing/2016/5/9/chartex" xmlns:cx4="http://schemas.microsoft.com/office/drawing/2016/5/10/chartex" xmlns:cx5="http://schemas.microsoft.com/office/drawing/2016/5/11/chartex" xmlns:cx6="http://schemas.microsoft.com/office/drawing/2016/5/12/chartex" xmlns:cx7="http://schemas.microsoft.com/office/drawing/2016/5/13/chartex" xmlns:cx8="http://schemas.microsoft.com/office/drawing/2016/5/14/chartex" xmlns:mc="http://schemas.openxmlformats.org/markup-compatibility/2006" xmlns:aink="http://schemas.microsoft.com/office/drawing/2016/ink" xmlns:am3d="http://schemas.microsoft.com/office/drawing/2017/model3d" xmlns:o="urn:schemas-microsoft-com:office:office" xmlns:oel="http://schemas.microsoft.com/office/2019/extlst" xmlns:r="http://schemas.openxmlformats.org/officeDocument/2006/relationships" xmlns:m="http://schemas.openxmlformats.org/officeDocument/2006/math" xmlns:v="urn:schemas-microsoft-com:vml" xmlns:wp14="http://schemas.microsoft.com/office/word/2010/wordprocessingDrawing" xmlns:wp="http://schemas.openxmlformats.org/drawingml/2006/wordprocessingDrawing" xmlns:w10="urn:schemas-microsoft-com:office:word" xmlns:w="http://schemas.openxmlformats.org/wordprocessingml/2006/main" xmlns:w14="http://schemas.microsoft.com/office/word/2010/wordml" xmlns:w15="http://schemas.microsoft.com/office/word/2012/wordml" xmlns:w16cex="http://schemas.microsoft.com/office/word/2018/wordml/cex" xmlns:w16cid="http://schemas.microsoft.com/office/word/2016/wordml/cid" xmlns:w16="http://schemas.microsoft.com/office/word/2018/wordml" xmlns:w16du="http://schemas.microsoft.com/office/word/2023/wordml/word16du" xmlns:w16sdtdh="http://schemas.microsoft.com/office/word/2020/wordml/sdtdatahash" xmlns:w16sdtfl="http://schemas.microsoft.com/office/word/2024/wordml/sdtformatlock" xmlns:w16se="http://schemas.microsoft.com/office/word/2015/wordml/symex" xmlns:wpg="http://schemas.microsoft.com/office/word/2010/wordprocessingGroup" xmlns:wpi="http://schemas.microsoft.com/office/word/2010/wordprocessingInk" xmlns:wne="http://schemas.microsoft.com/office/word/2006/wordml" xmlns:wps="http://schemas.microsoft.com/office/word/2010/wordprocessingShape" mc:Ignorable="w14 w15 w16se w16cid w16 w16cex w16sdtdh w16sdtfl w16du wp14">
+  <w:p>
+    <w:pPr>
+      <w:pStyle w:val="af2"/>
+    </w:pPr>
+  </w:p>
+</w:ftr>
+</file>
+
+<file path=word/footer2.xml><?xml version="1.0" encoding="utf-8"?>
 <w:ftr xmlns:wpc="http://schemas.microsoft.com/office/word/2010/wordprocessingCanvas" xmlns:cx="http://schemas.microsoft.com/office/drawing/2014/chartex" xmlns:cx1="http://schemas.microsoft.com/office/drawing/2015/9/8/chartex" xmlns:cx2="http://schemas.microsoft.com/office/drawing/2015/10/21/chartex" xmlns:cx3="http://schemas.microsoft.com/office/drawing/2016/5/9/chartex" xmlns:cx4="http://schemas.microsoft.com/office/drawing/2016/5/10/chartex" xmlns:cx5="http://schemas.microsoft.com/office/drawing/2016/5/11/chartex" xmlns:cx6="http://schemas.microsoft.com/office/drawing/2016/5/12/chartex" xmlns:cx7="http://schemas.microsoft.com/office/drawing/2016/5/13/chartex" xmlns:cx8="http://schemas.microsoft.com/office/drawing/2016/5/14/chartex" xmlns:mc="http://schemas.openxmlformats.org/markup-compatibility/2006" xmlns:aink="http://schemas.microsoft.com/office/drawing/2016/ink" xmlns:am3d="http://schemas.microsoft.com/office/drawing/2017/model3d" xmlns:o="urn:schemas-microsoft-com:office:office" xmlns:oel="http://schemas.microsoft.com/office/2019/extlst" xmlns:r="http://schemas.openxmlformats.org/officeDocument/2006/relationships" xmlns:m="http://schemas.openxmlformats.org/officeDocument/2006/math" xmlns:v="urn:schemas-microsoft-com:vml" xmlns:wp14="http://schemas.microsoft.com/office/word/2010/wordprocessingDrawing" xmlns:wp="http://schemas.openxmlformats.org/drawingml/2006/wordprocessingDrawing" xmlns:w10="urn:schemas-microsoft-com:office:word" xmlns:w="http://schemas.openxmlformats.org/wordprocessingml/2006/main" xmlns:w14="http://schemas.microsoft.com/office/word/2010/wordml" xmlns:w15="http://schemas.microsoft.com/office/word/2012/wordml" xmlns:w16cex="http://schemas.microsoft.com/office/word/2018/wordml/cex" xmlns:w16cid="http://schemas.microsoft.com/office/word/2016/wordml/cid" xmlns:w16="http://schemas.microsoft.com/office/word/2018/wordml" xmlns:w16du="http://schemas.microsoft.com/office/word/2023/wordml/word16du" xmlns:w16sdtdh="http://schemas.microsoft.com/office/word/2020/wordml/sdtdatahash" xmlns:w16sdtfl="http://schemas.microsoft.com/office/word/2024/wordml/sdtformatlock" xmlns:w16se="http://schemas.microsoft.com/office/word/2015/wordml/symex" xmlns:wpg="http://schemas.microsoft.com/office/word/2010/wordprocessingGroup" xmlns:wpi="http://schemas.microsoft.com/office/word/2010/wordprocessingInk" xmlns:wne="http://schemas.microsoft.com/office/word/2006/wordml" xmlns:wps="http://schemas.microsoft.com/office/word/2010/wordprocessingShape" mc:Ignorable="w14 w15 w16se w16cid w16 w16cex w16sdtdh w16sdtfl w16du wp14">
   <w:p>
     <w:pPr>
@@ -9514,6 +10041,16 @@
 </w:ftr>
 </file>
 
+<file path=word/footer3.xml><?xml version="1.0" encoding="utf-8"?>
+<w:ftr xmlns:wpc="http://schemas.microsoft.com/office/word/2010/wordprocessingCanvas" xmlns:cx="http://schemas.microsoft.com/office/drawing/2014/chartex" xmlns:cx1="http://schemas.microsoft.com/office/drawing/2015/9/8/chartex" xmlns:cx2="http://schemas.microsoft.com/office/drawing/2015/10/21/chartex" xmlns:cx3="http://schemas.microsoft.com/office/drawing/2016/5/9/chartex" xmlns:cx4="http://schemas.microsoft.com/office/drawing/2016/5/10/chartex" xmlns:cx5="http://schemas.microsoft.com/office/drawing/2016/5/11/chartex" xmlns:cx6="http://schemas.microsoft.com/office/drawing/2016/5/12/chartex" xmlns:cx7="http://schemas.microsoft.com/office/drawing/2016/5/13/chartex" xmlns:cx8="http://schemas.microsoft.com/office/drawing/2016/5/14/chartex" xmlns:mc="http://schemas.openxmlformats.org/markup-compatibility/2006" xmlns:aink="http://schemas.microsoft.com/office/drawing/2016/ink" xmlns:am3d="http://schemas.microsoft.com/office/drawing/2017/model3d" xmlns:o="urn:schemas-microsoft-com:office:office" xmlns:oel="http://schemas.microsoft.com/office/2019/extlst" xmlns:r="http://schemas.openxmlformats.org/officeDocument/2006/relationships" xmlns:m="http://schemas.openxmlformats.org/officeDocument/2006/math" xmlns:v="urn:schemas-microsoft-com:vml" xmlns:wp14="http://schemas.microsoft.com/office/word/2010/wordprocessingDrawing" xmlns:wp="http://schemas.openxmlformats.org/drawingml/2006/wordprocessingDrawing" xmlns:w10="urn:schemas-microsoft-com:office:word" xmlns:w="http://schemas.openxmlformats.org/wordprocessingml/2006/main" xmlns:w14="http://schemas.microsoft.com/office/word/2010/wordml" xmlns:w15="http://schemas.microsoft.com/office/word/2012/wordml" xmlns:w16cex="http://schemas.microsoft.com/office/word/2018/wordml/cex" xmlns:w16cid="http://schemas.microsoft.com/office/word/2016/wordml/cid" xmlns:w16="http://schemas.microsoft.com/office/word/2018/wordml" xmlns:w16du="http://schemas.microsoft.com/office/word/2023/wordml/word16du" xmlns:w16sdtdh="http://schemas.microsoft.com/office/word/2020/wordml/sdtdatahash" xmlns:w16sdtfl="http://schemas.microsoft.com/office/word/2024/wordml/sdtformatlock" xmlns:w16se="http://schemas.microsoft.com/office/word/2015/wordml/symex" xmlns:wpg="http://schemas.microsoft.com/office/word/2010/wordprocessingGroup" xmlns:wpi="http://schemas.microsoft.com/office/word/2010/wordprocessingInk" xmlns:wne="http://schemas.microsoft.com/office/word/2006/wordml" xmlns:wps="http://schemas.microsoft.com/office/word/2010/wordprocessingShape" mc:Ignorable="w14 w15 w16se w16cid w16 w16cex w16sdtdh w16sdtfl w16du wp14">
+  <w:p>
+    <w:pPr>
+      <w:pStyle w:val="af2"/>
+    </w:pPr>
+  </w:p>
+</w:ftr>
+</file>
+
 <file path=word/footnotes.xml><?xml version="1.0" encoding="utf-8"?>
 <w:footnotes xmlns:wpc="http://schemas.microsoft.com/office/word/2010/wordprocessingCanvas" xmlns:cx="http://schemas.microsoft.com/office/drawing/2014/chartex" xmlns:cx1="http://schemas.microsoft.com/office/drawing/2015/9/8/chartex" xmlns:cx2="http://schemas.microsoft.com/office/drawing/2015/10/21/chartex" xmlns:cx3="http://schemas.microsoft.com/office/drawing/2016/5/9/chartex" xmlns:cx4="http://schemas.microsoft.com/office/drawing/2016/5/10/chartex" xmlns:cx5="http://schemas.microsoft.com/office/drawing/2016/5/11/chartex" xmlns:cx6="http://schemas.microsoft.com/office/drawing/2016/5/12/chartex" xmlns:cx7="http://schemas.microsoft.com/office/drawing/2016/5/13/chartex" xmlns:cx8="http://schemas.microsoft.com/office/drawing/2016/5/14/chartex" xmlns:mc="http://schemas.openxmlformats.org/markup-compatibility/2006" xmlns:aink="http://schemas.microsoft.com/office/drawing/2016/ink" xmlns:am3d="http://schemas.microsoft.com/office/drawing/2017/model3d" xmlns:o="urn:schemas-microsoft-com:office:office" xmlns:oel="http://schemas.microsoft.com/office/2019/extlst" xmlns:r="http://schemas.openxmlformats.org/officeDocument/2006/relationships" xmlns:m="http://schemas.openxmlformats.org/officeDocument/2006/math" xmlns:v="urn:schemas-microsoft-com:vml" xmlns:wp14="http://schemas.microsoft.com/office/word/2010/wordprocessingDrawing" xmlns:wp="http://schemas.openxmlformats.org/drawingml/2006/wordprocessingDrawing" xmlns:w10="urn:schemas-microsoft-com:office:word" xmlns:w="http://schemas.openxmlformats.org/wordprocessingml/2006/main" xmlns:w14="http://schemas.microsoft.com/office/word/2010/wordml" xmlns:w15="http://schemas.microsoft.com/office/word/2012/wordml" xmlns:w16cex="http://schemas.microsoft.com/office/word/2018/wordml/cex" xmlns:w16cid="http://schemas.microsoft.com/office/word/2016/wordml/cid" xmlns:w16="http://schemas.microsoft.com/office/word/2018/wordml" xmlns:w16du="http://schemas.microsoft.com/office/word/2023/wordml/word16du" xmlns:w16sdtdh="http://schemas.microsoft.com/office/word/2020/wordml/sdtdatahash" xmlns:w16sdtfl="http://schemas.microsoft.com/office/word/2024/wordml/sdtformatlock" xmlns:w16se="http://schemas.microsoft.com/office/word/2015/wordml/symex" xmlns:wpg="http://schemas.microsoft.com/office/word/2010/wordprocessingGroup" xmlns:wpi="http://schemas.microsoft.com/office/word/2010/wordprocessingInk" xmlns:wne="http://schemas.microsoft.com/office/word/2006/wordml" xmlns:wps="http://schemas.microsoft.com/office/word/2010/wordprocessingShape" mc:Ignorable="w14 w15 w16se w16cid w16 w16cex w16sdtdh w16sdtfl w16du wp14">
   <w:footnote w:type="separator" w:id="-1">
@@ -9537,6 +10074,36 @@
     </w:p>
   </w:footnote>
 </w:footnotes>
+</file>
+
+<file path=word/header1.xml><?xml version="1.0" encoding="utf-8"?>
+<w:hdr xmlns:wpc="http://schemas.microsoft.com/office/word/2010/wordprocessingCanvas" xmlns:cx="http://schemas.microsoft.com/office/drawing/2014/chartex" xmlns:cx1="http://schemas.microsoft.com/office/drawing/2015/9/8/chartex" xmlns:cx2="http://schemas.microsoft.com/office/drawing/2015/10/21/chartex" xmlns:cx3="http://schemas.microsoft.com/office/drawing/2016/5/9/chartex" xmlns:cx4="http://schemas.microsoft.com/office/drawing/2016/5/10/chartex" xmlns:cx5="http://schemas.microsoft.com/office/drawing/2016/5/11/chartex" xmlns:cx6="http://schemas.microsoft.com/office/drawing/2016/5/12/chartex" xmlns:cx7="http://schemas.microsoft.com/office/drawing/2016/5/13/chartex" xmlns:cx8="http://schemas.microsoft.com/office/drawing/2016/5/14/chartex" xmlns:mc="http://schemas.openxmlformats.org/markup-compatibility/2006" xmlns:aink="http://schemas.microsoft.com/office/drawing/2016/ink" xmlns:am3d="http://schemas.microsoft.com/office/drawing/2017/model3d" xmlns:o="urn:schemas-microsoft-com:office:office" xmlns:oel="http://schemas.microsoft.com/office/2019/extlst" xmlns:r="http://schemas.openxmlformats.org/officeDocument/2006/relationships" xmlns:m="http://schemas.openxmlformats.org/officeDocument/2006/math" xmlns:v="urn:schemas-microsoft-com:vml" xmlns:wp14="http://schemas.microsoft.com/office/word/2010/wordprocessingDrawing" xmlns:wp="http://schemas.openxmlformats.org/drawingml/2006/wordprocessingDrawing" xmlns:w10="urn:schemas-microsoft-com:office:word" xmlns:w="http://schemas.openxmlformats.org/wordprocessingml/2006/main" xmlns:w14="http://schemas.microsoft.com/office/word/2010/wordml" xmlns:w15="http://schemas.microsoft.com/office/word/2012/wordml" xmlns:w16cex="http://schemas.microsoft.com/office/word/2018/wordml/cex" xmlns:w16cid="http://schemas.microsoft.com/office/word/2016/wordml/cid" xmlns:w16="http://schemas.microsoft.com/office/word/2018/wordml" xmlns:w16du="http://schemas.microsoft.com/office/word/2023/wordml/word16du" xmlns:w16sdtdh="http://schemas.microsoft.com/office/word/2020/wordml/sdtdatahash" xmlns:w16sdtfl="http://schemas.microsoft.com/office/word/2024/wordml/sdtformatlock" xmlns:w16se="http://schemas.microsoft.com/office/word/2015/wordml/symex" xmlns:wpg="http://schemas.microsoft.com/office/word/2010/wordprocessingGroup" xmlns:wpi="http://schemas.microsoft.com/office/word/2010/wordprocessingInk" xmlns:wne="http://schemas.microsoft.com/office/word/2006/wordml" xmlns:wps="http://schemas.microsoft.com/office/word/2010/wordprocessingShape" mc:Ignorable="w14 w15 w16se w16cid w16 w16cex w16sdtdh w16sdtfl w16du wp14">
+  <w:p>
+    <w:pPr>
+      <w:pStyle w:val="af0"/>
+    </w:pPr>
+  </w:p>
+</w:hdr>
+</file>
+
+<file path=word/header2.xml><?xml version="1.0" encoding="utf-8"?>
+<w:hdr xmlns:wpc="http://schemas.microsoft.com/office/word/2010/wordprocessingCanvas" xmlns:cx="http://schemas.microsoft.com/office/drawing/2014/chartex" xmlns:cx1="http://schemas.microsoft.com/office/drawing/2015/9/8/chartex" xmlns:cx2="http://schemas.microsoft.com/office/drawing/2015/10/21/chartex" xmlns:cx3="http://schemas.microsoft.com/office/drawing/2016/5/9/chartex" xmlns:cx4="http://schemas.microsoft.com/office/drawing/2016/5/10/chartex" xmlns:cx5="http://schemas.microsoft.com/office/drawing/2016/5/11/chartex" xmlns:cx6="http://schemas.microsoft.com/office/drawing/2016/5/12/chartex" xmlns:cx7="http://schemas.microsoft.com/office/drawing/2016/5/13/chartex" xmlns:cx8="http://schemas.microsoft.com/office/drawing/2016/5/14/chartex" xmlns:mc="http://schemas.openxmlformats.org/markup-compatibility/2006" xmlns:aink="http://schemas.microsoft.com/office/drawing/2016/ink" xmlns:am3d="http://schemas.microsoft.com/office/drawing/2017/model3d" xmlns:o="urn:schemas-microsoft-com:office:office" xmlns:oel="http://schemas.microsoft.com/office/2019/extlst" xmlns:r="http://schemas.openxmlformats.org/officeDocument/2006/relationships" xmlns:m="http://schemas.openxmlformats.org/officeDocument/2006/math" xmlns:v="urn:schemas-microsoft-com:vml" xmlns:wp14="http://schemas.microsoft.com/office/word/2010/wordprocessingDrawing" xmlns:wp="http://schemas.openxmlformats.org/drawingml/2006/wordprocessingDrawing" xmlns:w10="urn:schemas-microsoft-com:office:word" xmlns:w="http://schemas.openxmlformats.org/wordprocessingml/2006/main" xmlns:w14="http://schemas.microsoft.com/office/word/2010/wordml" xmlns:w15="http://schemas.microsoft.com/office/word/2012/wordml" xmlns:w16cex="http://schemas.microsoft.com/office/word/2018/wordml/cex" xmlns:w16cid="http://schemas.microsoft.com/office/word/2016/wordml/cid" xmlns:w16="http://schemas.microsoft.com/office/word/2018/wordml" xmlns:w16du="http://schemas.microsoft.com/office/word/2023/wordml/word16du" xmlns:w16sdtdh="http://schemas.microsoft.com/office/word/2020/wordml/sdtdatahash" xmlns:w16sdtfl="http://schemas.microsoft.com/office/word/2024/wordml/sdtformatlock" xmlns:w16se="http://schemas.microsoft.com/office/word/2015/wordml/symex" xmlns:wpg="http://schemas.microsoft.com/office/word/2010/wordprocessingGroup" xmlns:wpi="http://schemas.microsoft.com/office/word/2010/wordprocessingInk" xmlns:wne="http://schemas.microsoft.com/office/word/2006/wordml" xmlns:wps="http://schemas.microsoft.com/office/word/2010/wordprocessingShape" mc:Ignorable="w14 w15 w16se w16cid w16 w16cex w16sdtdh w16sdtfl w16du wp14">
+  <w:p>
+    <w:pPr>
+      <w:pStyle w:val="af0"/>
+    </w:pPr>
+  </w:p>
+</w:hdr>
+</file>
+
+<file path=word/header3.xml><?xml version="1.0" encoding="utf-8"?>
+<w:hdr xmlns:wpc="http://schemas.microsoft.com/office/word/2010/wordprocessingCanvas" xmlns:cx="http://schemas.microsoft.com/office/drawing/2014/chartex" xmlns:cx1="http://schemas.microsoft.com/office/drawing/2015/9/8/chartex" xmlns:cx2="http://schemas.microsoft.com/office/drawing/2015/10/21/chartex" xmlns:cx3="http://schemas.microsoft.com/office/drawing/2016/5/9/chartex" xmlns:cx4="http://schemas.microsoft.com/office/drawing/2016/5/10/chartex" xmlns:cx5="http://schemas.microsoft.com/office/drawing/2016/5/11/chartex" xmlns:cx6="http://schemas.microsoft.com/office/drawing/2016/5/12/chartex" xmlns:cx7="http://schemas.microsoft.com/office/drawing/2016/5/13/chartex" xmlns:cx8="http://schemas.microsoft.com/office/drawing/2016/5/14/chartex" xmlns:mc="http://schemas.openxmlformats.org/markup-compatibility/2006" xmlns:aink="http://schemas.microsoft.com/office/drawing/2016/ink" xmlns:am3d="http://schemas.microsoft.com/office/drawing/2017/model3d" xmlns:o="urn:schemas-microsoft-com:office:office" xmlns:oel="http://schemas.microsoft.com/office/2019/extlst" xmlns:r="http://schemas.openxmlformats.org/officeDocument/2006/relationships" xmlns:m="http://schemas.openxmlformats.org/officeDocument/2006/math" xmlns:v="urn:schemas-microsoft-com:vml" xmlns:wp14="http://schemas.microsoft.com/office/word/2010/wordprocessingDrawing" xmlns:wp="http://schemas.openxmlformats.org/drawingml/2006/wordprocessingDrawing" xmlns:w10="urn:schemas-microsoft-com:office:word" xmlns:w="http://schemas.openxmlformats.org/wordprocessingml/2006/main" xmlns:w14="http://schemas.microsoft.com/office/word/2010/wordml" xmlns:w15="http://schemas.microsoft.com/office/word/2012/wordml" xmlns:w16cex="http://schemas.microsoft.com/office/word/2018/wordml/cex" xmlns:w16cid="http://schemas.microsoft.com/office/word/2016/wordml/cid" xmlns:w16="http://schemas.microsoft.com/office/word/2018/wordml" xmlns:w16du="http://schemas.microsoft.com/office/word/2023/wordml/word16du" xmlns:w16sdtdh="http://schemas.microsoft.com/office/word/2020/wordml/sdtdatahash" xmlns:w16sdtfl="http://schemas.microsoft.com/office/word/2024/wordml/sdtformatlock" xmlns:w16se="http://schemas.microsoft.com/office/word/2015/wordml/symex" xmlns:wpg="http://schemas.microsoft.com/office/word/2010/wordprocessingGroup" xmlns:wpi="http://schemas.microsoft.com/office/word/2010/wordprocessingInk" xmlns:wne="http://schemas.microsoft.com/office/word/2006/wordml" xmlns:wps="http://schemas.microsoft.com/office/word/2010/wordprocessingShape" mc:Ignorable="w14 w15 w16se w16cid w16 w16cex w16sdtdh w16sdtfl w16du wp14">
+  <w:p>
+    <w:pPr>
+      <w:pStyle w:val="af0"/>
+    </w:pPr>
+  </w:p>
+</w:hdr>
 </file>
 
 <file path=word/numbering.xml><?xml version="1.0" encoding="utf-8"?>
@@ -9544,7 +10111,7 @@
   <w:abstractNum w:abstractNumId="0" w15:restartNumberingAfterBreak="0">
     <w:nsid w:val="0000A990"/>
     <w:multiLevelType w:val="multilevel"/>
-    <w:tmpl w:val="58784780"/>
+    <w:tmpl w:val="65D63C92"/>
     <w:lvl w:ilvl="0">
       <w:numFmt w:val="bullet"/>
       <w:lvlText w:val=" "/>
@@ -9621,7 +10188,7 @@
   <w:abstractNum w:abstractNumId="1" w15:restartNumberingAfterBreak="0">
     <w:nsid w:val="00A99411"/>
     <w:multiLevelType w:val="multilevel"/>
-    <w:tmpl w:val="CE3C5E44"/>
+    <w:tmpl w:val="81CE5622"/>
     <w:lvl w:ilvl="0">
       <w:start w:val="1"/>
       <w:numFmt w:val="decimal"/>
@@ -9704,10 +10271,10 @@
       </w:pPr>
     </w:lvl>
   </w:abstractNum>
-  <w:num w:numId="1" w16cid:durableId="1747797546">
+  <w:num w:numId="1" w16cid:durableId="98187553">
     <w:abstractNumId w:val="0"/>
   </w:num>
-  <w:num w:numId="2" w16cid:durableId="233708615">
+  <w:num w:numId="2" w16cid:durableId="132794297">
     <w:abstractNumId w:val="1"/>
     <w:lvlOverride w:ilvl="0">
       <w:startOverride w:val="1"/>
@@ -9737,7 +10304,7 @@
       <w:startOverride w:val="1"/>
     </w:lvlOverride>
   </w:num>
-  <w:num w:numId="3" w16cid:durableId="342706022">
+  <w:num w:numId="3" w16cid:durableId="1047755163">
     <w:abstractNumId w:val="1"/>
     <w:lvlOverride w:ilvl="0">
       <w:startOverride w:val="1"/>
@@ -11002,7 +11569,7 @@
     <w:name w:val="header"/>
     <w:basedOn w:val="a"/>
     <w:link w:val="af1"/>
-    <w:rsid w:val="00693568"/>
+    <w:rsid w:val="007C77DC"/>
     <w:pPr>
       <w:tabs>
         <w:tab w:val="center" w:pos="4513"/>
@@ -11020,7 +11587,7 @@
     <w:name w:val="页眉 字符"/>
     <w:basedOn w:val="a1"/>
     <w:link w:val="af0"/>
-    <w:rsid w:val="00693568"/>
+    <w:rsid w:val="007C77DC"/>
     <w:rPr>
       <w:sz w:val="18"/>
       <w:szCs w:val="18"/>
@@ -11030,7 +11597,7 @@
     <w:name w:val="footer"/>
     <w:basedOn w:val="a"/>
     <w:link w:val="af3"/>
-    <w:rsid w:val="00693568"/>
+    <w:rsid w:val="007C77DC"/>
     <w:pPr>
       <w:tabs>
         <w:tab w:val="center" w:pos="4513"/>
@@ -11047,7 +11614,7 @@
     <w:name w:val="页脚 字符"/>
     <w:basedOn w:val="a1"/>
     <w:link w:val="af2"/>
-    <w:rsid w:val="00693568"/>
+    <w:rsid w:val="007C77DC"/>
     <w:rPr>
       <w:sz w:val="18"/>
       <w:szCs w:val="18"/>

</xml_diff>

<commit_message>
Add repository documentation and release metadata
Document the reproducible workflow and expose the finalized report for public use.

Co-authored-by: Cursor <cursoragent@cursor.com>
</commit_message>
<xml_diff>
--- a/deliverables/04_manuscript/report.docx
+++ b/deliverables/04_manuscript/report.docx
@@ -1525,7 +1525,7 @@
           <w:noProof/>
         </w:rPr>
         <w:drawing>
-          <wp:inline distT="0" distB="0" distL="0" distR="0" wp14:anchorId="01ADA6FC" wp14:editId="7DEBCCE3">
+          <wp:inline distT="0" distB="0" distL="0" distR="0" wp14:anchorId="236DE690" wp14:editId="4A32DF4E">
             <wp:extent cx="5334000" cy="4440530"/>
             <wp:effectExtent l="0" t="0" r="0" b="0"/>
             <wp:docPr id="11" name="Picture" descr="S组不同总剂量下的转移特性（线性坐标）"/>
@@ -1662,7 +1662,7 @@
         </w:rPr>
         <w:lastRenderedPageBreak/>
         <w:drawing>
-          <wp:inline distT="0" distB="0" distL="0" distR="0" wp14:anchorId="5A201B46" wp14:editId="1CC3321C">
+          <wp:inline distT="0" distB="0" distL="0" distR="0" wp14:anchorId="1CAD87A2" wp14:editId="48391297">
             <wp:extent cx="5334000" cy="4354429"/>
             <wp:effectExtent l="0" t="0" r="0" b="0"/>
             <wp:docPr id="14" name="Picture" descr="S组不同总剂量下的转移特性（半对数坐标）"/>
@@ -1799,7 +1799,7 @@
         </w:rPr>
         <w:lastRenderedPageBreak/>
         <w:drawing>
-          <wp:inline distT="0" distB="0" distL="0" distR="0" wp14:anchorId="0766224F" wp14:editId="743EE4C6">
+          <wp:inline distT="0" distB="0" distL="0" distR="0" wp14:anchorId="508B024C" wp14:editId="7FE3F679">
             <wp:extent cx="5334000" cy="3546760"/>
             <wp:effectExtent l="0" t="0" r="0" b="0"/>
             <wp:docPr id="17" name="Picture" descr="S组不同总剂量下的输出特性（VGS=-20 V，半对数坐标）"/>
@@ -1969,7 +1969,7 @@
         </w:rPr>
         <w:lastRenderedPageBreak/>
         <w:drawing>
-          <wp:inline distT="0" distB="0" distL="0" distR="0" wp14:anchorId="2BDB62FD" wp14:editId="1A713C7C">
+          <wp:inline distT="0" distB="0" distL="0" distR="0" wp14:anchorId="67736A21" wp14:editId="51BB5CAA">
             <wp:extent cx="5334000" cy="4440530"/>
             <wp:effectExtent l="0" t="0" r="0" b="0"/>
             <wp:docPr id="20" name="Picture" descr="T组不同总剂量下的转移特性（线性坐标）"/>
@@ -2106,7 +2106,7 @@
         </w:rPr>
         <w:lastRenderedPageBreak/>
         <w:drawing>
-          <wp:inline distT="0" distB="0" distL="0" distR="0" wp14:anchorId="052A19D9" wp14:editId="3B2E412C">
+          <wp:inline distT="0" distB="0" distL="0" distR="0" wp14:anchorId="1BDEB615" wp14:editId="49FC12AE">
             <wp:extent cx="5334000" cy="4354429"/>
             <wp:effectExtent l="0" t="0" r="0" b="0"/>
             <wp:docPr id="23" name="Picture" descr="T组不同总剂量下的转移特性（半对数坐标）"/>
@@ -2243,7 +2243,7 @@
         </w:rPr>
         <w:lastRenderedPageBreak/>
         <w:drawing>
-          <wp:inline distT="0" distB="0" distL="0" distR="0" wp14:anchorId="7886F652" wp14:editId="6CA4909D">
+          <wp:inline distT="0" distB="0" distL="0" distR="0" wp14:anchorId="666568E3" wp14:editId="5B75B7D6">
             <wp:extent cx="5334000" cy="3546760"/>
             <wp:effectExtent l="0" t="0" r="0" b="0"/>
             <wp:docPr id="26" name="Picture" descr="T组不同总剂量下的输出特性（VGS=-20 V，半对数坐标）"/>
@@ -3949,7 +3949,7 @@
           <w:noProof/>
         </w:rPr>
         <w:drawing>
-          <wp:inline distT="0" distB="0" distL="0" distR="0" wp14:anchorId="004CB560" wp14:editId="19D6CB5D">
+          <wp:inline distT="0" distB="0" distL="0" distR="0" wp14:anchorId="4E1A71BF" wp14:editId="678A8087">
             <wp:extent cx="5334000" cy="4729884"/>
             <wp:effectExtent l="0" t="0" r="0" b="0"/>
             <wp:docPr id="32" name="Picture" descr="S/T组阈值电压随总剂量的变化"/>
@@ -4086,7 +4086,7 @@
         </w:rPr>
         <w:lastRenderedPageBreak/>
         <w:drawing>
-          <wp:inline distT="0" distB="0" distL="0" distR="0" wp14:anchorId="60447E0F" wp14:editId="3EA4F466">
+          <wp:inline distT="0" distB="0" distL="0" distR="0" wp14:anchorId="4771BA92" wp14:editId="710F52B8">
             <wp:extent cx="5334000" cy="4687540"/>
             <wp:effectExtent l="0" t="0" r="0" b="0"/>
             <wp:docPr id="35" name="Picture" descr="S/T组相对0 krad(Si)的阈值电压漂移"/>
@@ -4259,10 +4259,7 @@
         <w:t>统计归纳：</w:t>
       </w:r>
       <w:r>
-        <w:t xml:space="preserve"> </w:t>
-      </w:r>
-      <w:r>
-        <w:t xml:space="preserve">60 krad(Si) </w:t>
+        <w:t xml:space="preserve"> 60 krad(Si) </w:t>
       </w:r>
       <w:r>
         <w:rPr>
@@ -4747,16 +4744,7 @@
           <w:rPr>
             <w:rFonts w:ascii="Cambria Math" w:hAnsi="Cambria Math"/>
           </w:rPr>
-          <m:t>-</m:t>
-        </m:r>
-        <m:r>
-          <m:rPr>
-            <m:sty m:val="p"/>
-          </m:rPr>
-          <w:rPr>
-            <w:rFonts w:ascii="Cambria Math" w:hAnsi="Cambria Math"/>
-          </w:rPr>
-          <m:t>(</m:t>
+          <m:t>-(</m:t>
         </m:r>
         <m:r>
           <w:rPr>
@@ -4897,16 +4885,7 @@
           <w:rPr>
             <w:rFonts w:ascii="Cambria Math" w:hAnsi="Cambria Math"/>
           </w:rPr>
-          <m:t>-</m:t>
-        </m:r>
-        <m:r>
-          <m:rPr>
-            <m:sty m:val="p"/>
-          </m:rPr>
-          <w:rPr>
-            <w:rFonts w:ascii="Cambria Math" w:hAnsi="Cambria Math"/>
-          </w:rPr>
-          <m:t>(</m:t>
+          <m:t>-(</m:t>
         </m:r>
         <m:r>
           <w:rPr>
@@ -4986,7 +4965,7 @@
         </w:rPr>
         <w:lastRenderedPageBreak/>
         <w:drawing>
-          <wp:inline distT="0" distB="0" distL="0" distR="0" wp14:anchorId="5940CF22" wp14:editId="265742A4">
+          <wp:inline distT="0" distB="0" distL="0" distR="0" wp14:anchorId="73E55B52" wp14:editId="40ED4A02">
             <wp:extent cx="5334000" cy="4687540"/>
             <wp:effectExtent l="0" t="0" r="0" b="0"/>
             <wp:docPr id="39" name="Picture" descr="S/T组峰值跨导相对变化随总剂量的变化"/>
@@ -5253,10 +5232,7 @@
         </m:r>
       </m:oMath>
       <w:r>
-        <w:t xml:space="preserve"> </w:t>
-      </w:r>
-      <w:r>
-        <w:t>mV/dec</w:t>
+        <w:t xml:space="preserve"> mV/dec</w:t>
       </w:r>
       <w:r>
         <w:t>。</w:t>
@@ -5482,7 +5458,7 @@
         </w:rPr>
         <w:lastRenderedPageBreak/>
         <w:drawing>
-          <wp:inline distT="0" distB="0" distL="0" distR="0" wp14:anchorId="7CA447A5" wp14:editId="455D7C61">
+          <wp:inline distT="0" distB="0" distL="0" distR="0" wp14:anchorId="6A3CF3E2" wp14:editId="3F65180B">
             <wp:extent cx="5334000" cy="4584501"/>
             <wp:effectExtent l="0" t="0" r="0" b="0"/>
             <wp:docPr id="42" name="Picture" descr="S/T组亚阈值摆幅随总剂量的变化"/>
@@ -6785,7 +6761,7 @@
           <w:noProof/>
         </w:rPr>
         <w:drawing>
-          <wp:inline distT="0" distB="0" distL="0" distR="0" wp14:anchorId="2E795D65" wp14:editId="0100C276">
+          <wp:inline distT="0" distB="0" distL="0" distR="0" wp14:anchorId="245829E7" wp14:editId="654C3677">
             <wp:extent cx="5334000" cy="4494166"/>
             <wp:effectExtent l="0" t="0" r="0" b="0"/>
             <wp:docPr id="47" name="Picture" descr="S/T组30 V漏电流随总剂量的变化"/>
@@ -7006,13 +6982,7 @@
           <w:rPr>
             <w:rFonts w:ascii="Cambria Math" w:hAnsi="Cambria Math"/>
           </w:rPr>
-          <m:t>1 </m:t>
-        </m:r>
-        <m:r>
-          <w:rPr>
-            <w:rFonts w:ascii="Cambria Math" w:hAnsi="Cambria Math"/>
-          </w:rPr>
-          <m:t>μ</m:t>
+          <m:t>1 μ</m:t>
         </m:r>
       </m:oMath>
       <w:r>
@@ -7329,7 +7299,7 @@
         </w:rPr>
         <w:lastRenderedPageBreak/>
         <w:drawing>
-          <wp:inline distT="0" distB="0" distL="0" distR="0" wp14:anchorId="1530E962" wp14:editId="10761724">
+          <wp:inline distT="0" distB="0" distL="0" distR="0" wp14:anchorId="37D2723C" wp14:editId="1F753D11">
             <wp:extent cx="5334000" cy="4624023"/>
             <wp:effectExtent l="0" t="0" r="0" b="0"/>
             <wp:docPr id="50" name="Picture" descr="S/T组达到1 µA漏电流所需漏极电压随总剂量的变化"/>
@@ -8397,7 +8367,7 @@
         </w:rPr>
         <w:lastRenderedPageBreak/>
         <w:drawing>
-          <wp:inline distT="0" distB="0" distL="0" distR="0" wp14:anchorId="1D628A72" wp14:editId="686608BF">
+          <wp:inline distT="0" distB="0" distL="0" distR="0" wp14:anchorId="6FB483C6" wp14:editId="7B303185">
             <wp:extent cx="5334000" cy="4300793"/>
             <wp:effectExtent l="0" t="0" r="0" b="0"/>
             <wp:docPr id="55" name="Picture" descr="S组连续加压扫描后30 V漏电流相对首次扫描的降低"/>
@@ -9960,12 +9930,7 @@
       <w:bookmarkEnd w:id="14"/>
     </w:p>
     <w:sectPr>
-      <w:headerReference w:type="even" r:id="rId20"/>
-      <w:headerReference w:type="default" r:id="rId21"/>
-      <w:footerReference w:type="even" r:id="rId22"/>
-      <w:footerReference w:type="default" r:id="rId23"/>
-      <w:headerReference w:type="first" r:id="rId24"/>
-      <w:footerReference w:type="first" r:id="rId25"/>
+      <w:footerReference w:type="default" r:id="rId20"/>
       <w:footnotePr>
         <w:numRestart w:val="eachSect"/>
       </w:footnotePr>
@@ -10004,16 +9969,6 @@
 </file>
 
 <file path=word/footer1.xml><?xml version="1.0" encoding="utf-8"?>
-<w:ftr xmlns:wpc="http://schemas.microsoft.com/office/word/2010/wordprocessingCanvas" xmlns:cx="http://schemas.microsoft.com/office/drawing/2014/chartex" xmlns:cx1="http://schemas.microsoft.com/office/drawing/2015/9/8/chartex" xmlns:cx2="http://schemas.microsoft.com/office/drawing/2015/10/21/chartex" xmlns:cx3="http://schemas.microsoft.com/office/drawing/2016/5/9/chartex" xmlns:cx4="http://schemas.microsoft.com/office/drawing/2016/5/10/chartex" xmlns:cx5="http://schemas.microsoft.com/office/drawing/2016/5/11/chartex" xmlns:cx6="http://schemas.microsoft.com/office/drawing/2016/5/12/chartex" xmlns:cx7="http://schemas.microsoft.com/office/drawing/2016/5/13/chartex" xmlns:cx8="http://schemas.microsoft.com/office/drawing/2016/5/14/chartex" xmlns:mc="http://schemas.openxmlformats.org/markup-compatibility/2006" xmlns:aink="http://schemas.microsoft.com/office/drawing/2016/ink" xmlns:am3d="http://schemas.microsoft.com/office/drawing/2017/model3d" xmlns:o="urn:schemas-microsoft-com:office:office" xmlns:oel="http://schemas.microsoft.com/office/2019/extlst" xmlns:r="http://schemas.openxmlformats.org/officeDocument/2006/relationships" xmlns:m="http://schemas.openxmlformats.org/officeDocument/2006/math" xmlns:v="urn:schemas-microsoft-com:vml" xmlns:wp14="http://schemas.microsoft.com/office/word/2010/wordprocessingDrawing" xmlns:wp="http://schemas.openxmlformats.org/drawingml/2006/wordprocessingDrawing" xmlns:w10="urn:schemas-microsoft-com:office:word" xmlns:w="http://schemas.openxmlformats.org/wordprocessingml/2006/main" xmlns:w14="http://schemas.microsoft.com/office/word/2010/wordml" xmlns:w15="http://schemas.microsoft.com/office/word/2012/wordml" xmlns:w16cex="http://schemas.microsoft.com/office/word/2018/wordml/cex" xmlns:w16cid="http://schemas.microsoft.com/office/word/2016/wordml/cid" xmlns:w16="http://schemas.microsoft.com/office/word/2018/wordml" xmlns:w16du="http://schemas.microsoft.com/office/word/2023/wordml/word16du" xmlns:w16sdtdh="http://schemas.microsoft.com/office/word/2020/wordml/sdtdatahash" xmlns:w16sdtfl="http://schemas.microsoft.com/office/word/2024/wordml/sdtformatlock" xmlns:w16se="http://schemas.microsoft.com/office/word/2015/wordml/symex" xmlns:wpg="http://schemas.microsoft.com/office/word/2010/wordprocessingGroup" xmlns:wpi="http://schemas.microsoft.com/office/word/2010/wordprocessingInk" xmlns:wne="http://schemas.microsoft.com/office/word/2006/wordml" xmlns:wps="http://schemas.microsoft.com/office/word/2010/wordprocessingShape" mc:Ignorable="w14 w15 w16se w16cid w16 w16cex w16sdtdh w16sdtfl w16du wp14">
-  <w:p>
-    <w:pPr>
-      <w:pStyle w:val="af2"/>
-    </w:pPr>
-  </w:p>
-</w:ftr>
-</file>
-
-<file path=word/footer2.xml><?xml version="1.0" encoding="utf-8"?>
 <w:ftr xmlns:wpc="http://schemas.microsoft.com/office/word/2010/wordprocessingCanvas" xmlns:cx="http://schemas.microsoft.com/office/drawing/2014/chartex" xmlns:cx1="http://schemas.microsoft.com/office/drawing/2015/9/8/chartex" xmlns:cx2="http://schemas.microsoft.com/office/drawing/2015/10/21/chartex" xmlns:cx3="http://schemas.microsoft.com/office/drawing/2016/5/9/chartex" xmlns:cx4="http://schemas.microsoft.com/office/drawing/2016/5/10/chartex" xmlns:cx5="http://schemas.microsoft.com/office/drawing/2016/5/11/chartex" xmlns:cx6="http://schemas.microsoft.com/office/drawing/2016/5/12/chartex" xmlns:cx7="http://schemas.microsoft.com/office/drawing/2016/5/13/chartex" xmlns:cx8="http://schemas.microsoft.com/office/drawing/2016/5/14/chartex" xmlns:mc="http://schemas.openxmlformats.org/markup-compatibility/2006" xmlns:aink="http://schemas.microsoft.com/office/drawing/2016/ink" xmlns:am3d="http://schemas.microsoft.com/office/drawing/2017/model3d" xmlns:o="urn:schemas-microsoft-com:office:office" xmlns:oel="http://schemas.microsoft.com/office/2019/extlst" xmlns:r="http://schemas.openxmlformats.org/officeDocument/2006/relationships" xmlns:m="http://schemas.openxmlformats.org/officeDocument/2006/math" xmlns:v="urn:schemas-microsoft-com:vml" xmlns:wp14="http://schemas.microsoft.com/office/word/2010/wordprocessingDrawing" xmlns:wp="http://schemas.openxmlformats.org/drawingml/2006/wordprocessingDrawing" xmlns:w10="urn:schemas-microsoft-com:office:word" xmlns:w="http://schemas.openxmlformats.org/wordprocessingml/2006/main" xmlns:w14="http://schemas.microsoft.com/office/word/2010/wordml" xmlns:w15="http://schemas.microsoft.com/office/word/2012/wordml" xmlns:w16cex="http://schemas.microsoft.com/office/word/2018/wordml/cex" xmlns:w16cid="http://schemas.microsoft.com/office/word/2016/wordml/cid" xmlns:w16="http://schemas.microsoft.com/office/word/2018/wordml" xmlns:w16du="http://schemas.microsoft.com/office/word/2023/wordml/word16du" xmlns:w16sdtdh="http://schemas.microsoft.com/office/word/2020/wordml/sdtdatahash" xmlns:w16sdtfl="http://schemas.microsoft.com/office/word/2024/wordml/sdtformatlock" xmlns:w16se="http://schemas.microsoft.com/office/word/2015/wordml/symex" xmlns:wpg="http://schemas.microsoft.com/office/word/2010/wordprocessingGroup" xmlns:wpi="http://schemas.microsoft.com/office/word/2010/wordprocessingInk" xmlns:wne="http://schemas.microsoft.com/office/word/2006/wordml" xmlns:wps="http://schemas.microsoft.com/office/word/2010/wordprocessingShape" mc:Ignorable="w14 w15 w16se w16cid w16 w16cex w16sdtdh w16sdtfl w16du wp14">
   <w:p>
     <w:pPr>
@@ -10041,16 +9996,6 @@
 </w:ftr>
 </file>
 
-<file path=word/footer3.xml><?xml version="1.0" encoding="utf-8"?>
-<w:ftr xmlns:wpc="http://schemas.microsoft.com/office/word/2010/wordprocessingCanvas" xmlns:cx="http://schemas.microsoft.com/office/drawing/2014/chartex" xmlns:cx1="http://schemas.microsoft.com/office/drawing/2015/9/8/chartex" xmlns:cx2="http://schemas.microsoft.com/office/drawing/2015/10/21/chartex" xmlns:cx3="http://schemas.microsoft.com/office/drawing/2016/5/9/chartex" xmlns:cx4="http://schemas.microsoft.com/office/drawing/2016/5/10/chartex" xmlns:cx5="http://schemas.microsoft.com/office/drawing/2016/5/11/chartex" xmlns:cx6="http://schemas.microsoft.com/office/drawing/2016/5/12/chartex" xmlns:cx7="http://schemas.microsoft.com/office/drawing/2016/5/13/chartex" xmlns:cx8="http://schemas.microsoft.com/office/drawing/2016/5/14/chartex" xmlns:mc="http://schemas.openxmlformats.org/markup-compatibility/2006" xmlns:aink="http://schemas.microsoft.com/office/drawing/2016/ink" xmlns:am3d="http://schemas.microsoft.com/office/drawing/2017/model3d" xmlns:o="urn:schemas-microsoft-com:office:office" xmlns:oel="http://schemas.microsoft.com/office/2019/extlst" xmlns:r="http://schemas.openxmlformats.org/officeDocument/2006/relationships" xmlns:m="http://schemas.openxmlformats.org/officeDocument/2006/math" xmlns:v="urn:schemas-microsoft-com:vml" xmlns:wp14="http://schemas.microsoft.com/office/word/2010/wordprocessingDrawing" xmlns:wp="http://schemas.openxmlformats.org/drawingml/2006/wordprocessingDrawing" xmlns:w10="urn:schemas-microsoft-com:office:word" xmlns:w="http://schemas.openxmlformats.org/wordprocessingml/2006/main" xmlns:w14="http://schemas.microsoft.com/office/word/2010/wordml" xmlns:w15="http://schemas.microsoft.com/office/word/2012/wordml" xmlns:w16cex="http://schemas.microsoft.com/office/word/2018/wordml/cex" xmlns:w16cid="http://schemas.microsoft.com/office/word/2016/wordml/cid" xmlns:w16="http://schemas.microsoft.com/office/word/2018/wordml" xmlns:w16du="http://schemas.microsoft.com/office/word/2023/wordml/word16du" xmlns:w16sdtdh="http://schemas.microsoft.com/office/word/2020/wordml/sdtdatahash" xmlns:w16sdtfl="http://schemas.microsoft.com/office/word/2024/wordml/sdtformatlock" xmlns:w16se="http://schemas.microsoft.com/office/word/2015/wordml/symex" xmlns:wpg="http://schemas.microsoft.com/office/word/2010/wordprocessingGroup" xmlns:wpi="http://schemas.microsoft.com/office/word/2010/wordprocessingInk" xmlns:wne="http://schemas.microsoft.com/office/word/2006/wordml" xmlns:wps="http://schemas.microsoft.com/office/word/2010/wordprocessingShape" mc:Ignorable="w14 w15 w16se w16cid w16 w16cex w16sdtdh w16sdtfl w16du wp14">
-  <w:p>
-    <w:pPr>
-      <w:pStyle w:val="af2"/>
-    </w:pPr>
-  </w:p>
-</w:ftr>
-</file>
-
 <file path=word/footnotes.xml><?xml version="1.0" encoding="utf-8"?>
 <w:footnotes xmlns:wpc="http://schemas.microsoft.com/office/word/2010/wordprocessingCanvas" xmlns:cx="http://schemas.microsoft.com/office/drawing/2014/chartex" xmlns:cx1="http://schemas.microsoft.com/office/drawing/2015/9/8/chartex" xmlns:cx2="http://schemas.microsoft.com/office/drawing/2015/10/21/chartex" xmlns:cx3="http://schemas.microsoft.com/office/drawing/2016/5/9/chartex" xmlns:cx4="http://schemas.microsoft.com/office/drawing/2016/5/10/chartex" xmlns:cx5="http://schemas.microsoft.com/office/drawing/2016/5/11/chartex" xmlns:cx6="http://schemas.microsoft.com/office/drawing/2016/5/12/chartex" xmlns:cx7="http://schemas.microsoft.com/office/drawing/2016/5/13/chartex" xmlns:cx8="http://schemas.microsoft.com/office/drawing/2016/5/14/chartex" xmlns:mc="http://schemas.openxmlformats.org/markup-compatibility/2006" xmlns:aink="http://schemas.microsoft.com/office/drawing/2016/ink" xmlns:am3d="http://schemas.microsoft.com/office/drawing/2017/model3d" xmlns:o="urn:schemas-microsoft-com:office:office" xmlns:oel="http://schemas.microsoft.com/office/2019/extlst" xmlns:r="http://schemas.openxmlformats.org/officeDocument/2006/relationships" xmlns:m="http://schemas.openxmlformats.org/officeDocument/2006/math" xmlns:v="urn:schemas-microsoft-com:vml" xmlns:wp14="http://schemas.microsoft.com/office/word/2010/wordprocessingDrawing" xmlns:wp="http://schemas.openxmlformats.org/drawingml/2006/wordprocessingDrawing" xmlns:w10="urn:schemas-microsoft-com:office:word" xmlns:w="http://schemas.openxmlformats.org/wordprocessingml/2006/main" xmlns:w14="http://schemas.microsoft.com/office/word/2010/wordml" xmlns:w15="http://schemas.microsoft.com/office/word/2012/wordml" xmlns:w16cex="http://schemas.microsoft.com/office/word/2018/wordml/cex" xmlns:w16cid="http://schemas.microsoft.com/office/word/2016/wordml/cid" xmlns:w16="http://schemas.microsoft.com/office/word/2018/wordml" xmlns:w16du="http://schemas.microsoft.com/office/word/2023/wordml/word16du" xmlns:w16sdtdh="http://schemas.microsoft.com/office/word/2020/wordml/sdtdatahash" xmlns:w16sdtfl="http://schemas.microsoft.com/office/word/2024/wordml/sdtformatlock" xmlns:w16se="http://schemas.microsoft.com/office/word/2015/wordml/symex" xmlns:wpg="http://schemas.microsoft.com/office/word/2010/wordprocessingGroup" xmlns:wpi="http://schemas.microsoft.com/office/word/2010/wordprocessingInk" xmlns:wne="http://schemas.microsoft.com/office/word/2006/wordml" xmlns:wps="http://schemas.microsoft.com/office/word/2010/wordprocessingShape" mc:Ignorable="w14 w15 w16se w16cid w16 w16cex w16sdtdh w16sdtfl w16du wp14">
   <w:footnote w:type="separator" w:id="-1">
@@ -10074,36 +10019,6 @@
     </w:p>
   </w:footnote>
 </w:footnotes>
-</file>
-
-<file path=word/header1.xml><?xml version="1.0" encoding="utf-8"?>
-<w:hdr xmlns:wpc="http://schemas.microsoft.com/office/word/2010/wordprocessingCanvas" xmlns:cx="http://schemas.microsoft.com/office/drawing/2014/chartex" xmlns:cx1="http://schemas.microsoft.com/office/drawing/2015/9/8/chartex" xmlns:cx2="http://schemas.microsoft.com/office/drawing/2015/10/21/chartex" xmlns:cx3="http://schemas.microsoft.com/office/drawing/2016/5/9/chartex" xmlns:cx4="http://schemas.microsoft.com/office/drawing/2016/5/10/chartex" xmlns:cx5="http://schemas.microsoft.com/office/drawing/2016/5/11/chartex" xmlns:cx6="http://schemas.microsoft.com/office/drawing/2016/5/12/chartex" xmlns:cx7="http://schemas.microsoft.com/office/drawing/2016/5/13/chartex" xmlns:cx8="http://schemas.microsoft.com/office/drawing/2016/5/14/chartex" xmlns:mc="http://schemas.openxmlformats.org/markup-compatibility/2006" xmlns:aink="http://schemas.microsoft.com/office/drawing/2016/ink" xmlns:am3d="http://schemas.microsoft.com/office/drawing/2017/model3d" xmlns:o="urn:schemas-microsoft-com:office:office" xmlns:oel="http://schemas.microsoft.com/office/2019/extlst" xmlns:r="http://schemas.openxmlformats.org/officeDocument/2006/relationships" xmlns:m="http://schemas.openxmlformats.org/officeDocument/2006/math" xmlns:v="urn:schemas-microsoft-com:vml" xmlns:wp14="http://schemas.microsoft.com/office/word/2010/wordprocessingDrawing" xmlns:wp="http://schemas.openxmlformats.org/drawingml/2006/wordprocessingDrawing" xmlns:w10="urn:schemas-microsoft-com:office:word" xmlns:w="http://schemas.openxmlformats.org/wordprocessingml/2006/main" xmlns:w14="http://schemas.microsoft.com/office/word/2010/wordml" xmlns:w15="http://schemas.microsoft.com/office/word/2012/wordml" xmlns:w16cex="http://schemas.microsoft.com/office/word/2018/wordml/cex" xmlns:w16cid="http://schemas.microsoft.com/office/word/2016/wordml/cid" xmlns:w16="http://schemas.microsoft.com/office/word/2018/wordml" xmlns:w16du="http://schemas.microsoft.com/office/word/2023/wordml/word16du" xmlns:w16sdtdh="http://schemas.microsoft.com/office/word/2020/wordml/sdtdatahash" xmlns:w16sdtfl="http://schemas.microsoft.com/office/word/2024/wordml/sdtformatlock" xmlns:w16se="http://schemas.microsoft.com/office/word/2015/wordml/symex" xmlns:wpg="http://schemas.microsoft.com/office/word/2010/wordprocessingGroup" xmlns:wpi="http://schemas.microsoft.com/office/word/2010/wordprocessingInk" xmlns:wne="http://schemas.microsoft.com/office/word/2006/wordml" xmlns:wps="http://schemas.microsoft.com/office/word/2010/wordprocessingShape" mc:Ignorable="w14 w15 w16se w16cid w16 w16cex w16sdtdh w16sdtfl w16du wp14">
-  <w:p>
-    <w:pPr>
-      <w:pStyle w:val="af0"/>
-    </w:pPr>
-  </w:p>
-</w:hdr>
-</file>
-
-<file path=word/header2.xml><?xml version="1.0" encoding="utf-8"?>
-<w:hdr xmlns:wpc="http://schemas.microsoft.com/office/word/2010/wordprocessingCanvas" xmlns:cx="http://schemas.microsoft.com/office/drawing/2014/chartex" xmlns:cx1="http://schemas.microsoft.com/office/drawing/2015/9/8/chartex" xmlns:cx2="http://schemas.microsoft.com/office/drawing/2015/10/21/chartex" xmlns:cx3="http://schemas.microsoft.com/office/drawing/2016/5/9/chartex" xmlns:cx4="http://schemas.microsoft.com/office/drawing/2016/5/10/chartex" xmlns:cx5="http://schemas.microsoft.com/office/drawing/2016/5/11/chartex" xmlns:cx6="http://schemas.microsoft.com/office/drawing/2016/5/12/chartex" xmlns:cx7="http://schemas.microsoft.com/office/drawing/2016/5/13/chartex" xmlns:cx8="http://schemas.microsoft.com/office/drawing/2016/5/14/chartex" xmlns:mc="http://schemas.openxmlformats.org/markup-compatibility/2006" xmlns:aink="http://schemas.microsoft.com/office/drawing/2016/ink" xmlns:am3d="http://schemas.microsoft.com/office/drawing/2017/model3d" xmlns:o="urn:schemas-microsoft-com:office:office" xmlns:oel="http://schemas.microsoft.com/office/2019/extlst" xmlns:r="http://schemas.openxmlformats.org/officeDocument/2006/relationships" xmlns:m="http://schemas.openxmlformats.org/officeDocument/2006/math" xmlns:v="urn:schemas-microsoft-com:vml" xmlns:wp14="http://schemas.microsoft.com/office/word/2010/wordprocessingDrawing" xmlns:wp="http://schemas.openxmlformats.org/drawingml/2006/wordprocessingDrawing" xmlns:w10="urn:schemas-microsoft-com:office:word" xmlns:w="http://schemas.openxmlformats.org/wordprocessingml/2006/main" xmlns:w14="http://schemas.microsoft.com/office/word/2010/wordml" xmlns:w15="http://schemas.microsoft.com/office/word/2012/wordml" xmlns:w16cex="http://schemas.microsoft.com/office/word/2018/wordml/cex" xmlns:w16cid="http://schemas.microsoft.com/office/word/2016/wordml/cid" xmlns:w16="http://schemas.microsoft.com/office/word/2018/wordml" xmlns:w16du="http://schemas.microsoft.com/office/word/2023/wordml/word16du" xmlns:w16sdtdh="http://schemas.microsoft.com/office/word/2020/wordml/sdtdatahash" xmlns:w16sdtfl="http://schemas.microsoft.com/office/word/2024/wordml/sdtformatlock" xmlns:w16se="http://schemas.microsoft.com/office/word/2015/wordml/symex" xmlns:wpg="http://schemas.microsoft.com/office/word/2010/wordprocessingGroup" xmlns:wpi="http://schemas.microsoft.com/office/word/2010/wordprocessingInk" xmlns:wne="http://schemas.microsoft.com/office/word/2006/wordml" xmlns:wps="http://schemas.microsoft.com/office/word/2010/wordprocessingShape" mc:Ignorable="w14 w15 w16se w16cid w16 w16cex w16sdtdh w16sdtfl w16du wp14">
-  <w:p>
-    <w:pPr>
-      <w:pStyle w:val="af0"/>
-    </w:pPr>
-  </w:p>
-</w:hdr>
-</file>
-
-<file path=word/header3.xml><?xml version="1.0" encoding="utf-8"?>
-<w:hdr xmlns:wpc="http://schemas.microsoft.com/office/word/2010/wordprocessingCanvas" xmlns:cx="http://schemas.microsoft.com/office/drawing/2014/chartex" xmlns:cx1="http://schemas.microsoft.com/office/drawing/2015/9/8/chartex" xmlns:cx2="http://schemas.microsoft.com/office/drawing/2015/10/21/chartex" xmlns:cx3="http://schemas.microsoft.com/office/drawing/2016/5/9/chartex" xmlns:cx4="http://schemas.microsoft.com/office/drawing/2016/5/10/chartex" xmlns:cx5="http://schemas.microsoft.com/office/drawing/2016/5/11/chartex" xmlns:cx6="http://schemas.microsoft.com/office/drawing/2016/5/12/chartex" xmlns:cx7="http://schemas.microsoft.com/office/drawing/2016/5/13/chartex" xmlns:cx8="http://schemas.microsoft.com/office/drawing/2016/5/14/chartex" xmlns:mc="http://schemas.openxmlformats.org/markup-compatibility/2006" xmlns:aink="http://schemas.microsoft.com/office/drawing/2016/ink" xmlns:am3d="http://schemas.microsoft.com/office/drawing/2017/model3d" xmlns:o="urn:schemas-microsoft-com:office:office" xmlns:oel="http://schemas.microsoft.com/office/2019/extlst" xmlns:r="http://schemas.openxmlformats.org/officeDocument/2006/relationships" xmlns:m="http://schemas.openxmlformats.org/officeDocument/2006/math" xmlns:v="urn:schemas-microsoft-com:vml" xmlns:wp14="http://schemas.microsoft.com/office/word/2010/wordprocessingDrawing" xmlns:wp="http://schemas.openxmlformats.org/drawingml/2006/wordprocessingDrawing" xmlns:w10="urn:schemas-microsoft-com:office:word" xmlns:w="http://schemas.openxmlformats.org/wordprocessingml/2006/main" xmlns:w14="http://schemas.microsoft.com/office/word/2010/wordml" xmlns:w15="http://schemas.microsoft.com/office/word/2012/wordml" xmlns:w16cex="http://schemas.microsoft.com/office/word/2018/wordml/cex" xmlns:w16cid="http://schemas.microsoft.com/office/word/2016/wordml/cid" xmlns:w16="http://schemas.microsoft.com/office/word/2018/wordml" xmlns:w16du="http://schemas.microsoft.com/office/word/2023/wordml/word16du" xmlns:w16sdtdh="http://schemas.microsoft.com/office/word/2020/wordml/sdtdatahash" xmlns:w16sdtfl="http://schemas.microsoft.com/office/word/2024/wordml/sdtformatlock" xmlns:w16se="http://schemas.microsoft.com/office/word/2015/wordml/symex" xmlns:wpg="http://schemas.microsoft.com/office/word/2010/wordprocessingGroup" xmlns:wpi="http://schemas.microsoft.com/office/word/2010/wordprocessingInk" xmlns:wne="http://schemas.microsoft.com/office/word/2006/wordml" xmlns:wps="http://schemas.microsoft.com/office/word/2010/wordprocessingShape" mc:Ignorable="w14 w15 w16se w16cid w16 w16cex w16sdtdh w16sdtfl w16du wp14">
-  <w:p>
-    <w:pPr>
-      <w:pStyle w:val="af0"/>
-    </w:pPr>
-  </w:p>
-</w:hdr>
 </file>
 
 <file path=word/numbering.xml><?xml version="1.0" encoding="utf-8"?>
@@ -10111,7 +10026,7 @@
   <w:abstractNum w:abstractNumId="0" w15:restartNumberingAfterBreak="0">
     <w:nsid w:val="0000A990"/>
     <w:multiLevelType w:val="multilevel"/>
-    <w:tmpl w:val="65D63C92"/>
+    <w:tmpl w:val="8B4E9A9E"/>
     <w:lvl w:ilvl="0">
       <w:numFmt w:val="bullet"/>
       <w:lvlText w:val=" "/>
@@ -10188,7 +10103,7 @@
   <w:abstractNum w:abstractNumId="1" w15:restartNumberingAfterBreak="0">
     <w:nsid w:val="00A99411"/>
     <w:multiLevelType w:val="multilevel"/>
-    <w:tmpl w:val="81CE5622"/>
+    <w:tmpl w:val="626C4FB6"/>
     <w:lvl w:ilvl="0">
       <w:start w:val="1"/>
       <w:numFmt w:val="decimal"/>
@@ -10271,10 +10186,10 @@
       </w:pPr>
     </w:lvl>
   </w:abstractNum>
-  <w:num w:numId="1" w16cid:durableId="98187553">
+  <w:num w:numId="1" w16cid:durableId="1237013820">
     <w:abstractNumId w:val="0"/>
   </w:num>
-  <w:num w:numId="2" w16cid:durableId="132794297">
+  <w:num w:numId="2" w16cid:durableId="38748328">
     <w:abstractNumId w:val="1"/>
     <w:lvlOverride w:ilvl="0">
       <w:startOverride w:val="1"/>
@@ -10304,7 +10219,7 @@
       <w:startOverride w:val="1"/>
     </w:lvlOverride>
   </w:num>
-  <w:num w:numId="3" w16cid:durableId="1047755163">
+  <w:num w:numId="3" w16cid:durableId="827213426">
     <w:abstractNumId w:val="1"/>
     <w:lvlOverride w:ilvl="0">
       <w:startOverride w:val="1"/>
@@ -11569,7 +11484,7 @@
     <w:name w:val="header"/>
     <w:basedOn w:val="a"/>
     <w:link w:val="af1"/>
-    <w:rsid w:val="007C77DC"/>
+    <w:rsid w:val="001C0D83"/>
     <w:pPr>
       <w:tabs>
         <w:tab w:val="center" w:pos="4513"/>
@@ -11587,7 +11502,7 @@
     <w:name w:val="页眉 字符"/>
     <w:basedOn w:val="a1"/>
     <w:link w:val="af0"/>
-    <w:rsid w:val="007C77DC"/>
+    <w:rsid w:val="001C0D83"/>
     <w:rPr>
       <w:sz w:val="18"/>
       <w:szCs w:val="18"/>
@@ -11597,7 +11512,7 @@
     <w:name w:val="footer"/>
     <w:basedOn w:val="a"/>
     <w:link w:val="af3"/>
-    <w:rsid w:val="007C77DC"/>
+    <w:rsid w:val="001C0D83"/>
     <w:pPr>
       <w:tabs>
         <w:tab w:val="center" w:pos="4513"/>
@@ -11614,7 +11529,7 @@
     <w:name w:val="页脚 字符"/>
     <w:basedOn w:val="a1"/>
     <w:link w:val="af2"/>
-    <w:rsid w:val="007C77DC"/>
+    <w:rsid w:val="001C0D83"/>
     <w:rPr>
       <w:sz w:val="18"/>
       <w:szCs w:val="18"/>

</xml_diff>